<commit_message>
Sửa sơ đồ (lối đi, Nhà Thuyền, dải xanh thấp), làm lại giao diện Bến Số, bổ sung nhóm người dùng giáo viên và du khách
Co-Authored-By: Claude Opus 5.5 <noreply@anthropic.com>
Claude-Session: https://claude.ai/code/session_016yb9UGMBdrbj8VwQqTGQjm
</commit_message>
<xml_diff>
--- a/thuyetminh/Thuyet_minh_Ben_Sang_Tao_Vung_Thung.docx
+++ b/thuyetminh/Thuyet_minh_Ben_Sang_Tao_Vung_Thung.docx
@@ -983,7 +983,7 @@
           <w:sz w:val="26"/>
           <w:szCs w:val="26"/>
         </w:rPr>
-        <w:t xml:space="preserve">bãi cỏ đa năng “Sân Bến”, sân chơi “Thúng Chai” tái sử dụng vật liệu nghề biển, “Góc thong thả” cho người lớn tuổi, dải cây đệm và vườn mưa dọc ranh giới nhà dân.</w:t>
+        <w:t xml:space="preserve">bãi cỏ đa năng “Sân Bến”, sân chơi “Thúng Chai” tái sử dụng vật liệu nghề biển, “Góc thong thả” cho người lớn tuổi, dải xanh thấp và vườn mưa dọc ranh giới phía sau.</w:t>
       </w:r>
     </w:p>
     <w:p>
@@ -1012,7 +1012,7 @@
           <w:sz w:val="26"/>
           <w:szCs w:val="26"/>
         </w:rPr>
-        <w:t xml:space="preserve">6 trạm dọc lối đi vòng, mỗi trạm kể một nét của nghề biển bằng ngôn ngữ khoa học – vì sao thúng chai nổi, nút buộc của ngư dân, con nước và mặt trăng, nhìn sao đi biển đến GPS, muối và nước mắm, hành trình chai nhựa ra biển. Trẻ em học khoa học từ chính nghề của ông bà mình.</w:t>
+        <w:t xml:space="preserve">6 trạm dọc lối đi vòng dành cho trẻ em, các lớp học ngoài trời và du khách; mỗi trạm kể một nét của nghề biển bằng ngôn ngữ khoa học – vì sao thúng chai nổi, nút buộc của ngư dân, con nước và mặt trăng, nhìn sao đi biển đến GPS, muối và nước mắm, hành trình chai nhựa ra biển. Trẻ em học khoa học từ chính nghề của ông bà mình.</w:t>
       </w:r>
     </w:p>
     <w:p>
@@ -1137,7 +1137,7 @@
           <w:sz w:val="26"/>
           <w:szCs w:val="26"/>
         </w:rPr>
-        <w:t xml:space="preserve">Theo số liệu Ban Tổ chức: diện tích khoảng 2.000 m²; các cạnh 82,12 m (giáp nhà dân), 41,15 m (đường Ngô Thì Trí), 38,57 m (đường Vũng Thùng 4), 51,13 m (đường Lý Nhật Quang); góc Ngô Thì Trí – Vũng Thùng 4 được bo tròn.</w:t>
+        <w:t xml:space="preserve">Theo số liệu Ban Tổ chức: diện tích khoảng 2.000 m²; các cạnh 82,12 m (phía sau, không giáp đường), 41,15 m (đường Ngô Thì Trí), 38,57 m (đường Vũng Thùng 4), 51,13 m (đường Lý Nhật Quang); góc Ngô Thì Trí – Vũng Thùng 4 được bo tròn.</w:t>
       </w:r>
     </w:p>
     <w:p>
@@ -1156,7 +1156,7 @@
           <w:sz w:val="26"/>
           <w:szCs w:val="26"/>
         </w:rPr>
-        <w:t xml:space="preserve">Ba mặt tiếp giáp đường, một mặt dài 82 m giáp trực tiếp nhà dân – đây là yếu tố quyết định cách bố trí (ồn, riêng tư, an ninh).</w:t>
+        <w:t xml:space="preserve">Ba mặt tiếp giáp đường; cạnh dài 82 m phía sau không giáp đường, tiếp giáp các lô đất/công trình lân cận (hiện trạng sẽ được xác nhận khi khảo sát). Phương án được thiết kế để phù hợp dù phía sau là nhà ở hay đất trống: không che nắng, không gây ồn, không tạo góc khuất.</w:t>
       </w:r>
     </w:p>
     <w:p>
@@ -1173,17 +1173,12 @@
           <w:sz w:val="27"/>
           <w:szCs w:val="27"/>
         </w:rPr>
-        <w:t xml:space="preserve">2.2. Người sử dụng và nhu cầu</w:t>
+        <w:t xml:space="preserve">2.2. Ai sẽ đến Bến, và họ cần gì?</w:t>
       </w:r>
     </w:p>
     <w:p>
       <w:pPr>
-        <w:pStyle w:val="ListParagraph"/>
-        <w:numPr>
-          <w:ilvl w:val="0"/>
-          <w:numId w:val="3"/>
-        </w:numPr>
-        <w:spacing w:after="80" w:line="290"/>
+        <w:spacing w:after="120" w:line="300"/>
         <w:jc w:val="both"/>
       </w:pPr>
       <w:r>
@@ -1192,17 +1187,566 @@
           <w:sz w:val="26"/>
           <w:szCs w:val="26"/>
         </w:rPr>
-        <w:t xml:space="preserve">Người dùng chính là cư dân khu phố: trẻ em, người lớn tuổi, các gia đình gắn bó với nghề biển. Công viên nhỏ, nằm trong khu dân cư nên phải phục vụ sinh hoạt hằng ngày trước tiên.</w:t>
+        <w:t xml:space="preserve">Khu đất nhỏ nhưng nằm ở vị trí giao thoa: giữa khu dân cư làng cá, gần bến neo đậu Vũng Thùng, cầu Thuận Phước, cảng Tiên Sa và các tuyến du lịch của bán đảo Sơn Trà. Vì vậy công viên cần phục vụ bốn nhóm người dùng, mỗi nhóm một nhu cầu khác nhau nhưng dùng chung một không gian:</w:t>
+      </w:r>
+    </w:p>
+    <w:tbl>
+      <w:tblPr>
+        <w:tblW w:type="dxa" w:w="9638"/>
+        <w:tblBorders>
+          <w:top w:val="single" w:color="auto" w:sz="4"/>
+          <w:left w:val="single" w:color="auto" w:sz="4"/>
+          <w:bottom w:val="single" w:color="auto" w:sz="4"/>
+          <w:right w:val="single" w:color="auto" w:sz="4"/>
+          <w:insideH w:val="single" w:color="auto" w:sz="4"/>
+          <w:insideV w:val="single" w:color="auto" w:sz="4"/>
+        </w:tblBorders>
+      </w:tblPr>
+      <w:tblGrid>
+        <w:gridCol w:w="2120"/>
+        <w:gridCol w:w="3662"/>
+        <w:gridCol w:w="3856"/>
+      </w:tblGrid>
+      <w:tr>
+        <w:trPr>
+          <w:tblHeader/>
+        </w:trPr>
+        <w:tc>
+          <w:tcPr>
+            <w:tcW w:type="dxa" w:w="2120"/>
+            <w:tcBorders>
+              <w:top w:val="single" w:color="9AA5A0" w:sz="4"/>
+              <w:left w:val="single" w:color="9AA5A0" w:sz="4"/>
+              <w:bottom w:val="single" w:color="9AA5A0" w:sz="4"/>
+              <w:right w:val="single" w:color="9AA5A0" w:sz="4"/>
+            </w:tcBorders>
+            <w:shd w:fill="DCEBF5" w:color="auto" w:val="clear"/>
+            <w:tcMar>
+              <w:top w:type="dxa" w:w="60"/>
+              <w:left w:type="dxa" w:w="100"/>
+              <w:bottom w:type="dxa" w:w="60"/>
+              <w:right w:type="dxa" w:w="100"/>
+            </w:tcMar>
+          </w:tcPr>
+          <w:p>
+            <w:pPr>
+              <w:spacing w:after="40"/>
+            </w:pPr>
+            <w:r>
+              <w:rPr>
+                <w:rFonts w:ascii="Times New Roman" w:cs="Times New Roman" w:eastAsia="Times New Roman" w:hAnsi="Times New Roman"/>
+                <w:b/>
+                <w:bCs/>
+                <w:sz w:val="23"/>
+                <w:szCs w:val="23"/>
+              </w:rPr>
+              <w:t xml:space="preserve">Nhóm</w:t>
+            </w:r>
+          </w:p>
+        </w:tc>
+        <w:tc>
+          <w:tcPr>
+            <w:tcW w:type="dxa" w:w="3662"/>
+            <w:tcBorders>
+              <w:top w:val="single" w:color="9AA5A0" w:sz="4"/>
+              <w:left w:val="single" w:color="9AA5A0" w:sz="4"/>
+              <w:bottom w:val="single" w:color="9AA5A0" w:sz="4"/>
+              <w:right w:val="single" w:color="9AA5A0" w:sz="4"/>
+            </w:tcBorders>
+            <w:shd w:fill="DCEBF5" w:color="auto" w:val="clear"/>
+            <w:tcMar>
+              <w:top w:type="dxa" w:w="60"/>
+              <w:left w:type="dxa" w:w="100"/>
+              <w:bottom w:type="dxa" w:w="60"/>
+              <w:right w:type="dxa" w:w="100"/>
+            </w:tcMar>
+          </w:tcPr>
+          <w:p>
+            <w:pPr>
+              <w:spacing w:after="40"/>
+            </w:pPr>
+            <w:r>
+              <w:rPr>
+                <w:rFonts w:ascii="Times New Roman" w:cs="Times New Roman" w:eastAsia="Times New Roman" w:hAnsi="Times New Roman"/>
+                <w:b/>
+                <w:bCs/>
+                <w:sz w:val="23"/>
+                <w:szCs w:val="23"/>
+              </w:rPr>
+              <w:t xml:space="preserve">Nhu cầu</w:t>
+            </w:r>
+          </w:p>
+        </w:tc>
+        <w:tc>
+          <w:tcPr>
+            <w:tcW w:type="dxa" w:w="3856"/>
+            <w:tcBorders>
+              <w:top w:val="single" w:color="9AA5A0" w:sz="4"/>
+              <w:left w:val="single" w:color="9AA5A0" w:sz="4"/>
+              <w:bottom w:val="single" w:color="9AA5A0" w:sz="4"/>
+              <w:right w:val="single" w:color="9AA5A0" w:sz="4"/>
+            </w:tcBorders>
+            <w:shd w:fill="DCEBF5" w:color="auto" w:val="clear"/>
+            <w:tcMar>
+              <w:top w:type="dxa" w:w="60"/>
+              <w:left w:type="dxa" w:w="100"/>
+              <w:bottom w:type="dxa" w:w="60"/>
+              <w:right w:type="dxa" w:w="100"/>
+            </w:tcMar>
+          </w:tcPr>
+          <w:p>
+            <w:pPr>
+              <w:spacing w:after="40"/>
+            </w:pPr>
+            <w:r>
+              <w:rPr>
+                <w:rFonts w:ascii="Times New Roman" w:cs="Times New Roman" w:eastAsia="Times New Roman" w:hAnsi="Times New Roman"/>
+                <w:b/>
+                <w:bCs/>
+                <w:sz w:val="23"/>
+                <w:szCs w:val="23"/>
+              </w:rPr>
+              <w:t xml:space="preserve">Bến đáp ứng bằng</w:t>
+            </w:r>
+          </w:p>
+        </w:tc>
+      </w:tr>
+      <w:tr>
+        <w:trPr>
+          <w:tblHeader w:val="false"/>
+        </w:trPr>
+        <w:tc>
+          <w:tcPr>
+            <w:tcW w:type="dxa" w:w="2120"/>
+            <w:tcBorders>
+              <w:top w:val="single" w:color="9AA5A0" w:sz="4"/>
+              <w:left w:val="single" w:color="9AA5A0" w:sz="4"/>
+              <w:bottom w:val="single" w:color="9AA5A0" w:sz="4"/>
+              <w:right w:val="single" w:color="9AA5A0" w:sz="4"/>
+            </w:tcBorders>
+            <w:tcMar>
+              <w:top w:type="dxa" w:w="60"/>
+              <w:left w:type="dxa" w:w="100"/>
+              <w:bottom w:type="dxa" w:w="60"/>
+              <w:right w:type="dxa" w:w="100"/>
+            </w:tcMar>
+          </w:tcPr>
+          <w:p>
+            <w:pPr>
+              <w:spacing w:after="40"/>
+            </w:pPr>
+            <w:r>
+              <w:rPr>
+                <w:rFonts w:ascii="Times New Roman" w:cs="Times New Roman" w:eastAsia="Times New Roman" w:hAnsi="Times New Roman"/>
+                <w:b w:val="false"/>
+                <w:bCs w:val="false"/>
+                <w:sz w:val="23"/>
+                <w:szCs w:val="23"/>
+              </w:rPr>
+              <w:t xml:space="preserve">Cư dân khu phố – trẻ em, người lớn tuổi, các gia đình (nhóm chính, dùng hằng ngày)</w:t>
+            </w:r>
+          </w:p>
+        </w:tc>
+        <w:tc>
+          <w:tcPr>
+            <w:tcW w:type="dxa" w:w="3662"/>
+            <w:tcBorders>
+              <w:top w:val="single" w:color="9AA5A0" w:sz="4"/>
+              <w:left w:val="single" w:color="9AA5A0" w:sz="4"/>
+              <w:bottom w:val="single" w:color="9AA5A0" w:sz="4"/>
+              <w:right w:val="single" w:color="9AA5A0" w:sz="4"/>
+            </w:tcBorders>
+            <w:tcMar>
+              <w:top w:type="dxa" w:w="60"/>
+              <w:left w:type="dxa" w:w="100"/>
+              <w:bottom w:type="dxa" w:w="60"/>
+              <w:right w:type="dxa" w:w="100"/>
+            </w:tcMar>
+          </w:tcPr>
+          <w:p>
+            <w:pPr>
+              <w:spacing w:after="40"/>
+            </w:pPr>
+            <w:r>
+              <w:rPr>
+                <w:rFonts w:ascii="Times New Roman" w:cs="Times New Roman" w:eastAsia="Times New Roman" w:hAnsi="Times New Roman"/>
+                <w:b w:val="false"/>
+                <w:bCs w:val="false"/>
+                <w:sz w:val="23"/>
+                <w:szCs w:val="23"/>
+              </w:rPr>
+              <w:t xml:space="preserve">Chỗ chơi an toàn cho trẻ gần nhà; chỗ đi bộ, tập thể dục, ngồi nghỉ có bóng mát; không gian sinh hoạt chung của khu phố.</w:t>
+            </w:r>
+          </w:p>
+        </w:tc>
+        <w:tc>
+          <w:tcPr>
+            <w:tcW w:type="dxa" w:w="3856"/>
+            <w:tcBorders>
+              <w:top w:val="single" w:color="9AA5A0" w:sz="4"/>
+              <w:left w:val="single" w:color="9AA5A0" w:sz="4"/>
+              <w:bottom w:val="single" w:color="9AA5A0" w:sz="4"/>
+              <w:right w:val="single" w:color="9AA5A0" w:sz="4"/>
+            </w:tcBorders>
+            <w:tcMar>
+              <w:top w:type="dxa" w:w="60"/>
+              <w:left w:type="dxa" w:w="100"/>
+              <w:bottom w:type="dxa" w:w="60"/>
+              <w:right w:type="dxa" w:w="100"/>
+            </w:tcMar>
+          </w:tcPr>
+          <w:p>
+            <w:pPr>
+              <w:spacing w:after="40"/>
+            </w:pPr>
+            <w:r>
+              <w:rPr>
+                <w:rFonts w:ascii="Times New Roman" w:cs="Times New Roman" w:eastAsia="Times New Roman" w:hAnsi="Times New Roman"/>
+                <w:b w:val="false"/>
+                <w:bCs w:val="false"/>
+                <w:sz w:val="23"/>
+                <w:szCs w:val="23"/>
+              </w:rPr>
+              <w:t xml:space="preserve">Sân chơi Thúng Chai nhìn thấy từ vỉa hè; lối đi vòng ~135 m; Góc thong thả; bãi cỏ Sân Bến cho sinh hoạt cộng đồng; Hòm ý tưởng để chính cư dân quyết định công viên thay đổi thế nào.</w:t>
+            </w:r>
+          </w:p>
+        </w:tc>
+      </w:tr>
+      <w:tr>
+        <w:trPr>
+          <w:tblHeader w:val="false"/>
+        </w:trPr>
+        <w:tc>
+          <w:tcPr>
+            <w:tcW w:type="dxa" w:w="2120"/>
+            <w:tcBorders>
+              <w:top w:val="single" w:color="9AA5A0" w:sz="4"/>
+              <w:left w:val="single" w:color="9AA5A0" w:sz="4"/>
+              <w:bottom w:val="single" w:color="9AA5A0" w:sz="4"/>
+              <w:right w:val="single" w:color="9AA5A0" w:sz="4"/>
+            </w:tcBorders>
+            <w:tcMar>
+              <w:top w:type="dxa" w:w="60"/>
+              <w:left w:type="dxa" w:w="100"/>
+              <w:bottom w:type="dxa" w:w="60"/>
+              <w:right w:type="dxa" w:w="100"/>
+            </w:tcMar>
+          </w:tcPr>
+          <w:p>
+            <w:pPr>
+              <w:spacing w:after="40"/>
+            </w:pPr>
+            <w:r>
+              <w:rPr>
+                <w:rFonts w:ascii="Times New Roman" w:cs="Times New Roman" w:eastAsia="Times New Roman" w:hAnsi="Times New Roman"/>
+                <w:b w:val="false"/>
+                <w:bCs w:val="false"/>
+                <w:sz w:val="23"/>
+                <w:szCs w:val="23"/>
+              </w:rPr>
+              <w:t xml:space="preserve">Giáo viên và học sinh các trường lân cận (theo đoàn, theo lịch)</w:t>
+            </w:r>
+          </w:p>
+        </w:tc>
+        <w:tc>
+          <w:tcPr>
+            <w:tcW w:type="dxa" w:w="3662"/>
+            <w:tcBorders>
+              <w:top w:val="single" w:color="9AA5A0" w:sz="4"/>
+              <w:left w:val="single" w:color="9AA5A0" w:sz="4"/>
+              <w:bottom w:val="single" w:color="9AA5A0" w:sz="4"/>
+              <w:right w:val="single" w:color="9AA5A0" w:sz="4"/>
+            </w:tcBorders>
+            <w:tcMar>
+              <w:top w:type="dxa" w:w="60"/>
+              <w:left w:type="dxa" w:w="100"/>
+              <w:bottom w:type="dxa" w:w="60"/>
+              <w:right w:type="dxa" w:w="100"/>
+            </w:tcMar>
+          </w:tcPr>
+          <w:p>
+            <w:pPr>
+              <w:spacing w:after="40"/>
+            </w:pPr>
+            <w:r>
+              <w:rPr>
+                <w:rFonts w:ascii="Times New Roman" w:cs="Times New Roman" w:eastAsia="Times New Roman" w:hAnsi="Times New Roman"/>
+                <w:b w:val="false"/>
+                <w:bCs w:val="false"/>
+                <w:sz w:val="23"/>
+                <w:szCs w:val="23"/>
+              </w:rPr>
+              <w:t xml:space="preserve">Địa điểm học ngoài lớp gần trường, an toàn, không tốn phí, có nội dung gắn với chương trình khoa học và giáo dục địa phương.</w:t>
+            </w:r>
+          </w:p>
+        </w:tc>
+        <w:tc>
+          <w:tcPr>
+            <w:tcW w:type="dxa" w:w="3856"/>
+            <w:tcBorders>
+              <w:top w:val="single" w:color="9AA5A0" w:sz="4"/>
+              <w:left w:val="single" w:color="9AA5A0" w:sz="4"/>
+              <w:bottom w:val="single" w:color="9AA5A0" w:sz="4"/>
+              <w:right w:val="single" w:color="9AA5A0" w:sz="4"/>
+            </w:tcBorders>
+            <w:tcMar>
+              <w:top w:type="dxa" w:w="60"/>
+              <w:left w:type="dxa" w:w="100"/>
+              <w:bottom w:type="dxa" w:w="60"/>
+              <w:right w:type="dxa" w:w="100"/>
+            </w:tcMar>
+          </w:tcPr>
+          <w:p>
+            <w:pPr>
+              <w:spacing w:after="40"/>
+            </w:pPr>
+            <w:r>
+              <w:rPr>
+                <w:rFonts w:ascii="Times New Roman" w:cs="Times New Roman" w:eastAsia="Times New Roman" w:hAnsi="Times New Roman"/>
+                <w:b w:val="false"/>
+                <w:bCs w:val="false"/>
+                <w:sz w:val="23"/>
+                <w:szCs w:val="23"/>
+              </w:rPr>
+              <w:t xml:space="preserve">Hải trình STEM 6 trạm; gợi ý tiết học 60–75 phút; phiếu học tập in sẵn; học sinh không cần điện thoại riêng hay tài khoản; nhóm đủ 6 huy hiệu nhận chứng nhận.</w:t>
+            </w:r>
+          </w:p>
+        </w:tc>
+      </w:tr>
+      <w:tr>
+        <w:trPr>
+          <w:tblHeader w:val="false"/>
+        </w:trPr>
+        <w:tc>
+          <w:tcPr>
+            <w:tcW w:type="dxa" w:w="2120"/>
+            <w:tcBorders>
+              <w:top w:val="single" w:color="9AA5A0" w:sz="4"/>
+              <w:left w:val="single" w:color="9AA5A0" w:sz="4"/>
+              <w:bottom w:val="single" w:color="9AA5A0" w:sz="4"/>
+              <w:right w:val="single" w:color="9AA5A0" w:sz="4"/>
+            </w:tcBorders>
+            <w:tcMar>
+              <w:top w:type="dxa" w:w="60"/>
+              <w:left w:type="dxa" w:w="100"/>
+              <w:bottom w:type="dxa" w:w="60"/>
+              <w:right w:type="dxa" w:w="100"/>
+            </w:tcMar>
+          </w:tcPr>
+          <w:p>
+            <w:pPr>
+              <w:spacing w:after="40"/>
+            </w:pPr>
+            <w:r>
+              <w:rPr>
+                <w:rFonts w:ascii="Times New Roman" w:cs="Times New Roman" w:eastAsia="Times New Roman" w:hAnsi="Times New Roman"/>
+                <w:b w:val="false"/>
+                <w:bCs w:val="false"/>
+                <w:sz w:val="23"/>
+                <w:szCs w:val="23"/>
+              </w:rPr>
+              <w:t xml:space="preserve">Du khách trong nước và quốc tế (ghé thăm theo tuyến khám phá làng biển)</w:t>
+            </w:r>
+          </w:p>
+        </w:tc>
+        <w:tc>
+          <w:tcPr>
+            <w:tcW w:type="dxa" w:w="3662"/>
+            <w:tcBorders>
+              <w:top w:val="single" w:color="9AA5A0" w:sz="4"/>
+              <w:left w:val="single" w:color="9AA5A0" w:sz="4"/>
+              <w:bottom w:val="single" w:color="9AA5A0" w:sz="4"/>
+              <w:right w:val="single" w:color="9AA5A0" w:sz="4"/>
+            </w:tcBorders>
+            <w:tcMar>
+              <w:top w:type="dxa" w:w="60"/>
+              <w:left w:type="dxa" w:w="100"/>
+              <w:bottom w:type="dxa" w:w="60"/>
+              <w:right w:type="dxa" w:w="100"/>
+            </w:tcMar>
+          </w:tcPr>
+          <w:p>
+            <w:pPr>
+              <w:spacing w:after="40"/>
+            </w:pPr>
+            <w:r>
+              <w:rPr>
+                <w:rFonts w:ascii="Times New Roman" w:cs="Times New Roman" w:eastAsia="Times New Roman" w:hAnsi="Times New Roman"/>
+                <w:b w:val="false"/>
+                <w:bCs w:val="false"/>
+                <w:sz w:val="23"/>
+                <w:szCs w:val="23"/>
+              </w:rPr>
+              <w:t xml:space="preserve">Trải nghiệm văn hóa làng biển chân thực, ngắn gọn, miễn phí; thông tin có tiếng Anh.</w:t>
+            </w:r>
+          </w:p>
+        </w:tc>
+        <w:tc>
+          <w:tcPr>
+            <w:tcW w:type="dxa" w:w="3856"/>
+            <w:tcBorders>
+              <w:top w:val="single" w:color="9AA5A0" w:sz="4"/>
+              <w:left w:val="single" w:color="9AA5A0" w:sz="4"/>
+              <w:bottom w:val="single" w:color="9AA5A0" w:sz="4"/>
+              <w:right w:val="single" w:color="9AA5A0" w:sz="4"/>
+            </w:tcBorders>
+            <w:tcMar>
+              <w:top w:type="dxa" w:w="60"/>
+              <w:left w:type="dxa" w:w="100"/>
+              <w:bottom w:type="dxa" w:w="60"/>
+              <w:right w:type="dxa" w:w="100"/>
+            </w:tcMar>
+          </w:tcPr>
+          <w:p>
+            <w:pPr>
+              <w:spacing w:after="40"/>
+            </w:pPr>
+            <w:r>
+              <w:rPr>
+                <w:rFonts w:ascii="Times New Roman" w:cs="Times New Roman" w:eastAsia="Times New Roman" w:hAnsi="Times New Roman"/>
+                <w:b w:val="false"/>
+                <w:bCs w:val="false"/>
+                <w:sz w:val="23"/>
+                <w:szCs w:val="23"/>
+              </w:rPr>
+              <w:t xml:space="preserve">Hành trình tự khám phá 20–30 phút; nội dung tiếng Anh cho 6 trạm; điểm check-in thúng chai; lời nhắc tôn trọng sự yên tĩnh của khu dân cư.</w:t>
+            </w:r>
+          </w:p>
+        </w:tc>
+      </w:tr>
+      <w:tr>
+        <w:trPr>
+          <w:tblHeader w:val="false"/>
+        </w:trPr>
+        <w:tc>
+          <w:tcPr>
+            <w:tcW w:type="dxa" w:w="2120"/>
+            <w:tcBorders>
+              <w:top w:val="single" w:color="9AA5A0" w:sz="4"/>
+              <w:left w:val="single" w:color="9AA5A0" w:sz="4"/>
+              <w:bottom w:val="single" w:color="9AA5A0" w:sz="4"/>
+              <w:right w:val="single" w:color="9AA5A0" w:sz="4"/>
+            </w:tcBorders>
+            <w:tcMar>
+              <w:top w:type="dxa" w:w="60"/>
+              <w:left w:type="dxa" w:w="100"/>
+              <w:bottom w:type="dxa" w:w="60"/>
+              <w:right w:type="dxa" w:w="100"/>
+            </w:tcMar>
+          </w:tcPr>
+          <w:p>
+            <w:pPr>
+              <w:spacing w:after="40"/>
+            </w:pPr>
+            <w:r>
+              <w:rPr>
+                <w:rFonts w:ascii="Times New Roman" w:cs="Times New Roman" w:eastAsia="Times New Roman" w:hAnsi="Times New Roman"/>
+                <w:b w:val="false"/>
+                <w:bCs w:val="false"/>
+                <w:sz w:val="23"/>
+                <w:szCs w:val="23"/>
+              </w:rPr>
+              <w:t xml:space="preserve">Cộng đồng đổi mới sáng tạo – sinh viên, startup, các trường</w:t>
+            </w:r>
+          </w:p>
+        </w:tc>
+        <w:tc>
+          <w:tcPr>
+            <w:tcW w:type="dxa" w:w="3662"/>
+            <w:tcBorders>
+              <w:top w:val="single" w:color="9AA5A0" w:sz="4"/>
+              <w:left w:val="single" w:color="9AA5A0" w:sz="4"/>
+              <w:bottom w:val="single" w:color="9AA5A0" w:sz="4"/>
+              <w:right w:val="single" w:color="9AA5A0" w:sz="4"/>
+            </w:tcBorders>
+            <w:tcMar>
+              <w:top w:type="dxa" w:w="60"/>
+              <w:left w:type="dxa" w:w="100"/>
+              <w:bottom w:type="dxa" w:w="60"/>
+              <w:right w:type="dxa" w:w="100"/>
+            </w:tcMar>
+          </w:tcPr>
+          <w:p>
+            <w:pPr>
+              <w:spacing w:after="40"/>
+            </w:pPr>
+            <w:r>
+              <w:rPr>
+                <w:rFonts w:ascii="Times New Roman" w:cs="Times New Roman" w:eastAsia="Times New Roman" w:hAnsi="Times New Roman"/>
+                <w:b w:val="false"/>
+                <w:bCs w:val="false"/>
+                <w:sz w:val="23"/>
+                <w:szCs w:val="23"/>
+              </w:rPr>
+              <w:t xml:space="preserve">Nơi giới thiệu dự án, thử nghiệm ý tưởng với cộng đồng thật.</w:t>
+            </w:r>
+          </w:p>
+        </w:tc>
+        <w:tc>
+          <w:tcPr>
+            <w:tcW w:type="dxa" w:w="3856"/>
+            <w:tcBorders>
+              <w:top w:val="single" w:color="9AA5A0" w:sz="4"/>
+              <w:left w:val="single" w:color="9AA5A0" w:sz="4"/>
+              <w:bottom w:val="single" w:color="9AA5A0" w:sz="4"/>
+              <w:right w:val="single" w:color="9AA5A0" w:sz="4"/>
+            </w:tcBorders>
+            <w:tcMar>
+              <w:top w:type="dxa" w:w="60"/>
+              <w:left w:type="dxa" w:w="100"/>
+              <w:bottom w:type="dxa" w:w="60"/>
+              <w:right w:type="dxa" w:w="100"/>
+            </w:tcMar>
+          </w:tcPr>
+          <w:p>
+            <w:pPr>
+              <w:spacing w:after="40"/>
+            </w:pPr>
+            <w:r>
+              <w:rPr>
+                <w:rFonts w:ascii="Times New Roman" w:cs="Times New Roman" w:eastAsia="Times New Roman" w:hAnsi="Times New Roman"/>
+                <w:b w:val="false"/>
+                <w:bCs w:val="false"/>
+                <w:sz w:val="23"/>
+                <w:szCs w:val="23"/>
+              </w:rPr>
+              <w:t xml:space="preserve">Bảng Đổi mới Sơn Trà trưng bày luân phiên; workshop cuối tuần ở Nhà Thuyền; chiếu phim hoạt hình AI của cuộc thi SIF.</w:t>
+            </w:r>
+          </w:p>
+        </w:tc>
+      </w:tr>
+    </w:tbl>
+    <w:p>
+      <w:pPr>
+        <w:spacing w:after="120" w:line="300"/>
+        <w:jc w:val="both"/>
+      </w:pPr>
+      <w:r>
+        <w:rPr>
+          <w:rFonts w:ascii="Times New Roman" w:cs="Times New Roman" w:eastAsia="Times New Roman" w:hAnsi="Times New Roman"/>
+          <w:b/>
+          <w:bCs/>
+          <w:i/>
+          <w:iCs/>
+          <w:sz w:val="26"/>
+          <w:szCs w:val="26"/>
+        </w:rPr>
+        <w:t xml:space="preserve">Một buổi sáng ở Bến có thể trông như thế này: </w:t>
+      </w:r>
+      <w:r>
+        <w:rPr>
+          <w:rFonts w:ascii="Times New Roman" w:cs="Times New Roman" w:eastAsia="Times New Roman" w:hAnsi="Times New Roman"/>
+          <w:i/>
+          <w:iCs/>
+          <w:sz w:val="26"/>
+          <w:szCs w:val="26"/>
+        </w:rPr>
+        <w:t xml:space="preserve">6 giờ, các cụ tập thể dục ở Góc thong thả; 9 giờ, cô giáo dẫn một lớp đến, chia 6 nhóm, mỗi nhóm bắt đầu ở một trạm – nhóm này cãi nhau vì sao thúng chai nổi, nhóm kia tập thắt nút ghế đơn; 10 giờ, một gia đình du khách đi hết hải trình bằng tiếng Anh rồi chụp ảnh bên thúng chai; chiều tối, trẻ em khu phố ra Sân chơi Thúng Chai, còn bố mẹ bình chọn ý tưởng “chiếu phim tối thứ Bảy” trên điện thoại.</w:t>
       </w:r>
     </w:p>
     <w:p>
       <w:pPr>
-        <w:pStyle w:val="ListParagraph"/>
-        <w:numPr>
-          <w:ilvl w:val="0"/>
-          <w:numId w:val="3"/>
-        </w:numPr>
-        <w:spacing w:after="80" w:line="290"/>
+        <w:spacing w:after="120" w:line="300"/>
         <w:jc w:val="both"/>
       </w:pPr>
       <w:r>
@@ -1211,26 +1755,7 @@
           <w:sz w:val="26"/>
           <w:szCs w:val="26"/>
         </w:rPr>
-        <w:t xml:space="preserve">Khu dân cư mang ký ức làng cá rất rõ (thúng chai, bến thuyền, nghề cá) – một “bản sắc có sẵn” mà ít công viên có được, nhưng thế hệ trẻ ngày càng ít cơ hội tiếp xúc.</w:t>
-      </w:r>
-    </w:p>
-    <w:p>
-      <w:pPr>
-        <w:pStyle w:val="ListParagraph"/>
-        <w:numPr>
-          <w:ilvl w:val="0"/>
-          <w:numId w:val="3"/>
-        </w:numPr>
-        <w:spacing w:after="80" w:line="290"/>
-        <w:jc w:val="both"/>
-      </w:pPr>
-      <w:r>
-        <w:rPr>
-          <w:rFonts w:ascii="Times New Roman" w:cs="Times New Roman" w:eastAsia="Times New Roman" w:hAnsi="Times New Roman"/>
-          <w:sz w:val="26"/>
-          <w:szCs w:val="26"/>
-        </w:rPr>
-        <w:t xml:space="preserve">Là “Công viên Đổi mới Sáng tạo” của phường, khu đất cần thể hiện tinh thần đổi mới sáng tạo, có không gian cho hoạt động khoa học – công nghệ, khởi nghiệp.</w:t>
+        <w:t xml:space="preserve">Điểm chung của cả bốn nhóm là bản sắc làng cá – thúng chai, bến thuyền, con nước, nghề nước mắm. Đây là “tài sản có sẵn” hiếm có, nhưng thế hệ trẻ ngày càng ít cơ hội tiếp xúc. Bến biến tài sản đó thành nội dung học tập và trải nghiệm, đúng tinh thần một “Công viên Đổi mới Sáng tạo”: đổi mới không phải bằng thiết bị đắt tiền, mà bằng cách làm mới cách cộng đồng học, chơi và cùng quyết định về không gian của mình.</w:t>
       </w:r>
     </w:p>
     <w:p>
@@ -1369,7 +1894,7 @@
                 <w:sz w:val="23"/>
                 <w:szCs w:val="23"/>
               </w:rPr>
-              <w:t xml:space="preserve">Hằng ngày trước, sự kiện sau</w:t>
+              <w:t xml:space="preserve">Ưu tiên sinh hoạt hằng ngày</w:t>
             </w:r>
           </w:p>
         </w:tc>
@@ -1401,7 +1926,7 @@
                 <w:sz w:val="23"/>
                 <w:szCs w:val="23"/>
               </w:rPr>
-              <w:t xml:space="preserve">Bãi cỏ, sân chơi, chỗ ngồi dùng mỗi ngày; sự kiện chỉ dùng lại không gian đó vào cuối tuần.</w:t>
+              <w:t xml:space="preserve">Mọi không gian được thiết kế trước hết cho người dân dùng mỗi ngày. Các sự kiện cuối tuần (workshop, chiếu phim) tận dụng lại chính bãi cỏ và Nhà Thuyền, không xây công trình riêng chỉ để làm sự kiện.</w:t>
             </w:r>
           </w:p>
         </w:tc>
@@ -1438,7 +1963,7 @@
                 <w:sz w:val="23"/>
                 <w:szCs w:val="23"/>
               </w:rPr>
-              <w:t xml:space="preserve">Tôn trọng nhà dân liền kề</w:t>
+              <w:t xml:space="preserve">Tôn trọng các lô đất lân cận</w:t>
             </w:r>
           </w:p>
         </w:tc>
@@ -1470,7 +1995,7 @@
                 <w:sz w:val="23"/>
                 <w:szCs w:val="23"/>
               </w:rPr>
-              <w:t xml:space="preserve">Hoạt động ồn đặt sát mặt đường; dải cây đệm dọc cạnh 82 m; hoạt động kết thúc trước 21:00.</w:t>
+              <w:t xml:space="preserve">Hoạt động ồn đặt sát mặt đường; dọc cạnh 82 m chỉ trồng cây bụi, hoa thấp (≤ 2 m) để không che nắng, không cản gió; cây bóng mát bố trí phía mặt đường; hoạt động kết thúc trước 21:00.</w:t>
             </w:r>
           </w:p>
         </w:tc>
@@ -2252,7 +2777,7 @@
                 <w:sz w:val="23"/>
                 <w:szCs w:val="23"/>
               </w:rPr>
-              <w:t xml:space="preserve">Cạnh Sân Bến</w:t>
+              <w:t xml:space="preserve">Cạnh Sân Bến, trong vòng lối đi</w:t>
             </w:r>
           </w:p>
         </w:tc>
@@ -2284,7 +2809,7 @@
                 <w:sz w:val="23"/>
                 <w:szCs w:val="23"/>
               </w:rPr>
-              <w:t xml:space="preserve">55 m²</w:t>
+              <w:t xml:space="preserve">40 m²</w:t>
             </w:r>
           </w:p>
         </w:tc>
@@ -2619,7 +3144,7 @@
                 <w:sz w:val="23"/>
                 <w:szCs w:val="23"/>
               </w:rPr>
-              <w:t xml:space="preserve">Dải cây đệm + vườn mưa</w:t>
+              <w:t xml:space="preserve">Dải xanh thấp + vườn mưa</w:t>
             </w:r>
           </w:p>
         </w:tc>
@@ -2651,7 +3176,7 @@
                 <w:sz w:val="23"/>
                 <w:szCs w:val="23"/>
               </w:rPr>
-              <w:t xml:space="preserve">Dọc cạnh 82 m giáp nhà dân</w:t>
+              <w:t xml:space="preserve">Dọc cạnh 82 m phía sau</w:t>
             </w:r>
           </w:p>
         </w:tc>
@@ -2715,7 +3240,7 @@
                 <w:sz w:val="23"/>
                 <w:szCs w:val="23"/>
               </w:rPr>
-              <w:t xml:space="preserve">Cây bóng mát bản địa chịu gió mặn, giảm ồn và tạo riêng tư cho nhà dân; hai vườn mưa trũng nhẹ thấm nước trong ≤ 48 giờ, chống ngập cục bộ.</w:t>
+              <w:t xml:space="preserve">Cây bụi, hoa, cỏ cao không quá 2 m – tạo ranh giới mềm mà không che nắng, không cản gió tới các lô đất lân cận; hai vườn mưa trũng nhẹ thấm nước trong ≤ 48 giờ, chống ngập cục bộ.</w:t>
             </w:r>
           </w:p>
         </w:tc>
@@ -2784,7 +3309,7 @@
                 <w:sz w:val="23"/>
                 <w:szCs w:val="23"/>
               </w:rPr>
-              <w:t xml:space="preserve">Vòng quanh công viên, dài ~140 m</w:t>
+              <w:t xml:space="preserve">Vòng quanh Sân Bến và nhánh ra Lý Nhật Quang, dài ~135 m</w:t>
             </w:r>
           </w:p>
         </w:tc>
@@ -2816,7 +3341,7 @@
                 <w:sz w:val="23"/>
                 <w:szCs w:val="23"/>
               </w:rPr>
-              <w:t xml:space="preserve">350 m²</w:t>
+              <w:t xml:space="preserve">340 m²</w:t>
             </w:r>
           </w:p>
         </w:tc>
@@ -2949,7 +3474,7 @@
                 <w:sz w:val="23"/>
                 <w:szCs w:val="23"/>
               </w:rPr>
-              <w:t xml:space="preserve">~350 m²</w:t>
+              <w:t xml:space="preserve">~370 m²</w:t>
             </w:r>
           </w:p>
         </w:tc>
@@ -2981,7 +3506,7 @@
                 <w:sz w:val="23"/>
                 <w:szCs w:val="23"/>
               </w:rPr>
-              <w:t xml:space="preserve">Thảm cỏ, cây bụi thấp, cây bóng mát rải rác.</w:t>
+              <w:t xml:space="preserve">Thảm cỏ, cây bụi thấp; cây bóng mát đặt dọc mặt đường và quanh sân chơi, góc thong thả.</w:t>
             </w:r>
           </w:p>
         </w:tc>
@@ -4357,6 +4882,144 @@
                 <w:sz w:val="23"/>
                 <w:szCs w:val="23"/>
               </w:rPr>
+              <w:t xml:space="preserve">Lớp học ngoài trời</w:t>
+            </w:r>
+          </w:p>
+        </w:tc>
+        <w:tc>
+          <w:tcPr>
+            <w:tcW w:type="dxa" w:w="6939"/>
+            <w:tcBorders>
+              <w:top w:val="single" w:color="9AA5A0" w:sz="4"/>
+              <w:left w:val="single" w:color="9AA5A0" w:sz="4"/>
+              <w:bottom w:val="single" w:color="9AA5A0" w:sz="4"/>
+              <w:right w:val="single" w:color="9AA5A0" w:sz="4"/>
+            </w:tcBorders>
+            <w:tcMar>
+              <w:top w:type="dxa" w:w="60"/>
+              <w:left w:type="dxa" w:w="100"/>
+              <w:bottom w:type="dxa" w:w="60"/>
+              <w:right w:type="dxa" w:w="100"/>
+            </w:tcMar>
+          </w:tcPr>
+          <w:p>
+            <w:pPr>
+              <w:spacing w:after="40"/>
+            </w:pPr>
+            <w:r>
+              <w:rPr>
+                <w:rFonts w:ascii="Times New Roman" w:cs="Times New Roman" w:eastAsia="Times New Roman" w:hAnsi="Times New Roman"/>
+                <w:b w:val="false"/>
+                <w:bCs w:val="false"/>
+                <w:sz w:val="23"/>
+                <w:szCs w:val="23"/>
+              </w:rPr>
+              <w:t xml:space="preserve">Trang riêng cho giáo viên: gợi ý tiết học 60–75 phút, cách chia nhóm xoay vòng trạm, lưu ý an toàn, phiếu học tập in sẵn.</w:t>
+            </w:r>
+          </w:p>
+        </w:tc>
+      </w:tr>
+      <w:tr>
+        <w:trPr>
+          <w:tblHeader w:val="false"/>
+        </w:trPr>
+        <w:tc>
+          <w:tcPr>
+            <w:tcW w:type="dxa" w:w="2699"/>
+            <w:tcBorders>
+              <w:top w:val="single" w:color="9AA5A0" w:sz="4"/>
+              <w:left w:val="single" w:color="9AA5A0" w:sz="4"/>
+              <w:bottom w:val="single" w:color="9AA5A0" w:sz="4"/>
+              <w:right w:val="single" w:color="9AA5A0" w:sz="4"/>
+            </w:tcBorders>
+            <w:tcMar>
+              <w:top w:type="dxa" w:w="60"/>
+              <w:left w:type="dxa" w:w="100"/>
+              <w:bottom w:type="dxa" w:w="60"/>
+              <w:right w:type="dxa" w:w="100"/>
+            </w:tcMar>
+          </w:tcPr>
+          <w:p>
+            <w:pPr>
+              <w:spacing w:after="40"/>
+            </w:pPr>
+            <w:r>
+              <w:rPr>
+                <w:rFonts w:ascii="Times New Roman" w:cs="Times New Roman" w:eastAsia="Times New Roman" w:hAnsi="Times New Roman"/>
+                <w:b w:val="false"/>
+                <w:bCs w:val="false"/>
+                <w:sz w:val="23"/>
+                <w:szCs w:val="23"/>
+              </w:rPr>
+              <w:t xml:space="preserve">Du khách (tiếng Anh)</w:t>
+            </w:r>
+          </w:p>
+        </w:tc>
+        <w:tc>
+          <w:tcPr>
+            <w:tcW w:type="dxa" w:w="6939"/>
+            <w:tcBorders>
+              <w:top w:val="single" w:color="9AA5A0" w:sz="4"/>
+              <w:left w:val="single" w:color="9AA5A0" w:sz="4"/>
+              <w:bottom w:val="single" w:color="9AA5A0" w:sz="4"/>
+              <w:right w:val="single" w:color="9AA5A0" w:sz="4"/>
+            </w:tcBorders>
+            <w:tcMar>
+              <w:top w:type="dxa" w:w="60"/>
+              <w:left w:type="dxa" w:w="100"/>
+              <w:bottom w:type="dxa" w:w="60"/>
+              <w:right w:type="dxa" w:w="100"/>
+            </w:tcMar>
+          </w:tcPr>
+          <w:p>
+            <w:pPr>
+              <w:spacing w:after="40"/>
+            </w:pPr>
+            <w:r>
+              <w:rPr>
+                <w:rFonts w:ascii="Times New Roman" w:cs="Times New Roman" w:eastAsia="Times New Roman" w:hAnsi="Times New Roman"/>
+                <w:b w:val="false"/>
+                <w:bCs w:val="false"/>
+                <w:sz w:val="23"/>
+                <w:szCs w:val="23"/>
+              </w:rPr>
+              <w:t xml:space="preserve">Giới thiệu và nội dung 6 trạm bằng tiếng Anh; chuyển ngôn ngữ VI/EN ngay trên trang.</w:t>
+            </w:r>
+          </w:p>
+        </w:tc>
+      </w:tr>
+      <w:tr>
+        <w:trPr>
+          <w:tblHeader w:val="false"/>
+        </w:trPr>
+        <w:tc>
+          <w:tcPr>
+            <w:tcW w:type="dxa" w:w="2699"/>
+            <w:tcBorders>
+              <w:top w:val="single" w:color="9AA5A0" w:sz="4"/>
+              <w:left w:val="single" w:color="9AA5A0" w:sz="4"/>
+              <w:bottom w:val="single" w:color="9AA5A0" w:sz="4"/>
+              <w:right w:val="single" w:color="9AA5A0" w:sz="4"/>
+            </w:tcBorders>
+            <w:tcMar>
+              <w:top w:type="dxa" w:w="60"/>
+              <w:left w:type="dxa" w:w="100"/>
+              <w:bottom w:type="dxa" w:w="60"/>
+              <w:right w:type="dxa" w:w="100"/>
+            </w:tcMar>
+          </w:tcPr>
+          <w:p>
+            <w:pPr>
+              <w:spacing w:after="40"/>
+            </w:pPr>
+            <w:r>
+              <w:rPr>
+                <w:rFonts w:ascii="Times New Roman" w:cs="Times New Roman" w:eastAsia="Times New Roman" w:hAnsi="Times New Roman"/>
+                <w:b w:val="false"/>
+                <w:bCs w:val="false"/>
+                <w:sz w:val="23"/>
+                <w:szCs w:val="23"/>
+              </w:rPr>
               <w:t xml:space="preserve">Hòm ý tưởng và bình chọn</w:t>
             </w:r>
           </w:p>
@@ -4877,7 +5540,7 @@
           <w:sz w:val="26"/>
           <w:szCs w:val="26"/>
         </w:rPr>
-        <w:t xml:space="preserve">Nhóm đã xây dựng bản mẫu Bến Số chạy được trên điện thoại (web tĩnh, không cần máy chủ): trang chủ và bản đồ; 6 trạm với nội dung, nghe đọc, câu đố, huy hiệu và giấy chứng nhận; Hòm ý tưởng với gửi và bình chọn; báo cáo AI mẫu (dữ liệu minh họa); lịch hoạt động; đỡ đầu; báo sự cố; trang in mã QR cho từng trạm. Địa chỉ: </w:t>
+        <w:t xml:space="preserve">Nhóm đã xây dựng bản mẫu Bến Số chạy được trên điện thoại (web tĩnh, không cần máy chủ): trang chủ có bản đồ tương tác và lối vào riêng cho trẻ em, giáo viên, du khách, cư dân; 6 trạm với nội dung, nghe đọc, câu đố, huy hiệu và giấy chứng nhận; Hòm ý tưởng với gửi và bình chọn; báo cáo AI mẫu (dữ liệu minh họa); trang lớp học ngoài trời và phiếu học tập in; trang tiếng Anh cho du khách; lịch hoạt động; đỡ đầu; báo sự cố; trang in mã QR cho từng trạm. Địa chỉ: </w:t>
       </w:r>
       <w:r>
         <w:rPr>
@@ -6530,7 +7193,7 @@
                 <w:sz w:val="23"/>
                 <w:szCs w:val="23"/>
               </w:rPr>
-              <w:t xml:space="preserve">Dải cây đệm bản địa, vườn mưa, lối đi thấm nước, đèn năng lượng mặt trời, phân loại rác, tái sử dụng thúng chai.</w:t>
+              <w:t xml:space="preserve">Dải xanh thấp, cây bóng mát bản địa, vườn mưa, lối đi thấm nước, đèn năng lượng mặt trời, phân loại rác, tái sử dụng thúng chai.</w:t>
             </w:r>
           </w:p>
         </w:tc>
@@ -7274,7 +7937,7 @@
                 <w:sz w:val="23"/>
                 <w:szCs w:val="23"/>
               </w:rPr>
-              <w:t xml:space="preserve">Ảnh hưởng tới nhà dân liền kề (tiếng ồn, ánh sáng, riêng tư)</w:t>
+              <w:t xml:space="preserve">Ảnh hưởng tới các lô đất lân cận (che nắng, tiếng ồn, ánh sáng)</w:t>
             </w:r>
           </w:p>
         </w:tc>
@@ -7306,7 +7969,7 @@
                 <w:sz w:val="23"/>
                 <w:szCs w:val="23"/>
               </w:rPr>
-              <w:t xml:space="preserve">Hoạt động ồn đặt sát mặt đường; dải cây đệm dọc ranh giới; kết thúc trước 21:00; đèn thấp chiếu xuống, không rọi vào nhà.</w:t>
+              <w:t xml:space="preserve">Dọc ranh giới phía sau chỉ trồng cây thấp ≤ 2 m, cây tán lớn đặt phía mặt đường; hoạt động ồn đặt sát mặt đường; kết thúc trước 21:00; đèn thấp chiếu xuống.</w:t>
             </w:r>
           </w:p>
         </w:tc>
@@ -7582,7 +8245,7 @@
                 <w:sz w:val="23"/>
                 <w:szCs w:val="23"/>
               </w:rPr>
-              <w:t xml:space="preserve">Chọn cây bản địa chịu gió, không giòn gãy; trồng cách xa ranh nhà dân; cắt tỉa định kỳ.</w:t>
+              <w:t xml:space="preserve">Chọn cây bản địa chịu gió, không giòn gãy; cây lớn chỉ trồng phía mặt đường, cách xa ranh giới lô đất lân cận; cắt tỉa định kỳ.</w:t>
             </w:r>
           </w:p>
         </w:tc>

</xml_diff>

<commit_message>
Cập nhật theo hiện trạng: giữ cây vỉa hè, thêm Thuyền Ký Ức, mục hiện trạng trong thuyết minh
Co-Authored-By: Claude Opus 5.5 <noreply@anthropic.com>
Claude-Session: https://claude.ai/code/session_016yb9UGMBdrbj8VwQqTGQjm
</commit_message>
<xml_diff>
--- a/thuyetminh/Thuyet_minh_Ben_Sang_Tao_Vung_Thung.docx
+++ b/thuyetminh/Thuyet_minh_Ben_Sang_Tao_Vung_Thung.docx
@@ -1173,7 +1173,62 @@
           <w:sz w:val="27"/>
           <w:szCs w:val="27"/>
         </w:rPr>
-        <w:t xml:space="preserve">2.2. Ai sẽ đến Bến, và họ cần gì?</w:t>
+        <w:t xml:space="preserve">2.2. Hiện trạng: một khoảng đất bị bỏ quên</w:t>
+      </w:r>
+    </w:p>
+    <w:p>
+      <w:pPr>
+        <w:spacing w:after="120" w:line="300"/>
+        <w:jc w:val="both"/>
+      </w:pPr>
+      <w:r>
+        <w:rPr>
+          <w:rFonts w:ascii="Times New Roman" w:cs="Times New Roman" w:eastAsia="Times New Roman" w:hAnsi="Times New Roman"/>
+          <w:sz w:val="26"/>
+          <w:szCs w:val="26"/>
+        </w:rPr>
+        <w:t xml:space="preserve">Theo hình ảnh đường phố công khai (Google Street View, chụp tháng 3/2021 – hiện trạng cần được cập nhật khi khảo sát), khu đất là bãi đất trống cỏ dại mọc cao; ven đường có vật liệu gỗ, ván thuyền cũ tập kết, rác thải và một số lều tạm; trên khu đất còn một chiếc thuyền gỗ cũ không sử dụng. Vỉa hè đường Ngô Thì Trí đã có hàng cây lớn cho bóng mát. Xung quanh chủ yếu là nhà ở thấp tầng xen các lô đất trống, gần cảng cá và bến neo đậu Vũng Thùng.</w:t>
+      </w:r>
+    </w:p>
+    <w:p>
+      <w:pPr>
+        <w:spacing w:after="120" w:line="300"/>
+        <w:jc w:val="both"/>
+      </w:pPr>
+      <w:r>
+        <w:rPr>
+          <w:rFonts w:ascii="Times New Roman" w:cs="Times New Roman" w:eastAsia="Times New Roman" w:hAnsi="Times New Roman"/>
+          <w:b/>
+          <w:bCs/>
+          <w:sz w:val="26"/>
+          <w:szCs w:val="26"/>
+        </w:rPr>
+        <w:t xml:space="preserve">Vấn đề: </w:t>
+      </w:r>
+      <w:r>
+        <w:rPr>
+          <w:rFonts w:ascii="Times New Roman" w:cs="Times New Roman" w:eastAsia="Times New Roman" w:hAnsi="Times New Roman"/>
+          <w:sz w:val="26"/>
+          <w:szCs w:val="26"/>
+        </w:rPr>
+        <w:t xml:space="preserve">một khu đất 2.000 m² ngay giữa khu dân cư đang là điểm tập kết vật liệu và rác, không đem lại giá trị cho cộng đồng, trong khi khu phố thiếu chỗ vui chơi cho trẻ em, chỗ tập luyện cho người lớn tuổi và không gian sinh hoạt chung. Bến Sáng Tạo biến “khoảng đất bị bỏ quên” đó thành không gian của cả khu phố – và giữ lại chính những gì làm nên bản sắc của nó: hàng cây vỉa hè, chiếc thuyền gỗ cũ, câu chuyện làng cá.</w:t>
+      </w:r>
+    </w:p>
+    <w:p>
+      <w:pPr>
+        <w:pStyle w:val="Heading2"/>
+        <w:spacing w:after="100" w:before="200"/>
+      </w:pPr>
+      <w:r>
+        <w:rPr>
+          <w:rFonts w:ascii="Times New Roman" w:cs="Times New Roman" w:eastAsia="Times New Roman" w:hAnsi="Times New Roman"/>
+          <w:b/>
+          <w:bCs/>
+          <w:color w:val="023E8A"/>
+          <w:sz w:val="27"/>
+          <w:szCs w:val="27"/>
+        </w:rPr>
+        <w:t xml:space="preserve">2.3. Ai sẽ đến Bến, và họ cần gì?</w:t>
       </w:r>
     </w:p>
     <w:p>
@@ -1772,7 +1827,7 @@
           <w:sz w:val="27"/>
           <w:szCs w:val="27"/>
         </w:rPr>
-        <w:t xml:space="preserve">2.3. Nguyên tắc thiết kế rút ra</w:t>
+        <w:t xml:space="preserve">2.4. Nguyên tắc thiết kế rút ra</w:t>
       </w:r>
     </w:p>
     <w:tbl>
@@ -2170,7 +2225,7 @@
                 <w:sz w:val="23"/>
                 <w:szCs w:val="23"/>
               </w:rPr>
-              <w:t xml:space="preserve">Bản sắc thật</w:t>
+              <w:t xml:space="preserve">Bản sắc thật, giữ cái đang có</w:t>
             </w:r>
           </w:p>
         </w:tc>
@@ -2202,7 +2257,7 @@
                 <w:sz w:val="23"/>
                 <w:szCs w:val="23"/>
               </w:rPr>
-              <w:t xml:space="preserve">Lấy chính nghề biển của khu dân cư làm chất liệu cho không gian, sân chơi và nội dung giáo dục.</w:t>
+              <w:t xml:space="preserve">Lấy chính nghề biển của khu dân cư làm chất liệu; giữ lại hàng cây vỉa hè hiện hữu; tận dụng thuyền gỗ cũ (như chiếc thuyền đang nằm trên khu đất) thay vì dựng biểu tượng mới.</w:t>
             </w:r>
           </w:p>
         </w:tc>
@@ -2575,7 +2630,7 @@
                 <w:sz w:val="23"/>
                 <w:szCs w:val="23"/>
               </w:rPr>
-              <w:t xml:space="preserve">Quảng trường nhỏ; bảng bản đồ số và mã QR; “Bảng Đổi mới Sơn Trà” trưng bày luân phiên dự án học sinh, startup; thùng rác phân loại.</w:t>
+              <w:t xml:space="preserve">Quảng trường nhỏ; “Thuyền Ký Ức” – thuyền gỗ cũ của ngư dân được làm sạch, gia cố, biến thành bồn cây và điểm check-in (sau khi kiểm tra độ bền); bảng bản đồ số và mã QR; “Bảng Đổi mới Sơn Trà”; thùng rác phân loại.</w:t>
             </w:r>
           </w:p>
         </w:tc>
@@ -3506,7 +3561,7 @@
                 <w:sz w:val="23"/>
                 <w:szCs w:val="23"/>
               </w:rPr>
-              <w:t xml:space="preserve">Thảm cỏ, cây bụi thấp; cây bóng mát đặt dọc mặt đường và quanh sân chơi, góc thong thả.</w:t>
+              <w:t xml:space="preserve">Thảm cỏ, cây bụi thấp; cây bóng mát đặt dọc mặt đường và quanh sân chơi, góc thong thả. Giữ nguyên hàng cây vỉa hè hiện hữu trên đường Ngô Thì Trí.</w:t>
             </w:r>
           </w:p>
         </w:tc>
@@ -6830,7 +6885,7 @@
           <w:sz w:val="26"/>
           <w:szCs w:val="26"/>
         </w:rPr>
-        <w:t xml:space="preserve">Tái sử dụng vật liệu nghề biển (thúng chai đã xử lý) làm điểm nhấn thay cho công trình, tượng đài đắt tiền.</w:t>
+        <w:t xml:space="preserve">Tái sử dụng vật liệu nghề biển (thúng chai, thuyền gỗ cũ đã xử lý) làm điểm nhấn thay cho công trình, tượng đài đắt tiền; giữ lại cây xanh hiện hữu.</w:t>
       </w:r>
     </w:p>
     <w:p>
@@ -7331,7 +7386,7 @@
                 <w:sz w:val="23"/>
                 <w:szCs w:val="23"/>
               </w:rPr>
-              <w:t xml:space="preserve">Văn hóa biển, nghề cá, thúng chai, nghề nước mắm, câu chuyện làng cá Vũng Thùng.</w:t>
+              <w:t xml:space="preserve">Văn hóa biển, nghề cá, thúng chai, Thuyền Ký Ức, nghề nước mắm, câu chuyện làng cá Vũng Thùng.</w:t>
             </w:r>
           </w:p>
         </w:tc>
@@ -8805,7 +8860,7 @@
           <w:sz w:val="26"/>
           <w:szCs w:val="26"/>
         </w:rPr>
-        <w:t xml:space="preserve">Ảnh phối cảnh là ảnh minh họa được tạo bằng công cụ AI; sơ đồ mặt bằng và prototype do nhóm tác giả thực hiện. Không sử dụng hình ảnh, logo có bản quyền của bên thứ ba.</w:t>
+        <w:t xml:space="preserve">Ảnh phối cảnh là ảnh minh họa được tạo bằng công cụ AI; sơ đồ mặt bằng và prototype do nhóm tác giả thực hiện. Không sử dụng hình ảnh, logo có bản quyền của bên thứ ba; hình ảnh đường phố công khai chỉ được dùng để tham khảo hiện trạng, không đưa vào hồ sơ.</w:t>
       </w:r>
     </w:p>
     <w:p>

</xml_diff>

<commit_message>
Bỏ nhóm người dùng khởi nghiệp, viết lại nội dung trưng bày cho thực tế
Co-Authored-By: Claude Opus 5.5 <noreply@anthropic.com>
Claude-Session: https://claude.ai/code/session_016yb9UGMBdrbj8VwQqTGQjm
</commit_message>
<xml_diff>
--- a/thuyetminh/Thuyet_minh_Ben_Sang_Tao_Vung_Thung.docx
+++ b/thuyetminh/Thuyet_minh_Ben_Sang_Tao_Vung_Thung.docx
@@ -1242,7 +1242,7 @@
           <w:sz w:val="26"/>
           <w:szCs w:val="26"/>
         </w:rPr>
-        <w:t xml:space="preserve">Khu đất nhỏ nhưng nằm ở vị trí giao thoa: giữa khu dân cư làng cá, gần bến neo đậu Vũng Thùng, cầu Thuận Phước, cảng Tiên Sa và các tuyến du lịch của bán đảo Sơn Trà. Vì vậy công viên cần phục vụ bốn nhóm người dùng, mỗi nhóm một nhu cầu khác nhau nhưng dùng chung một không gian:</w:t>
+        <w:t xml:space="preserve">Khu đất nhỏ nhưng nằm ở vị trí giao thoa: giữa khu dân cư làng cá, gần bến neo đậu Vũng Thùng, cầu Thuận Phước, cảng Tiên Sa và các tuyến du lịch của bán đảo Sơn Trà. Vì vậy công viên cần phục vụ ba nhóm người dùng, mỗi nhóm một nhu cầu khác nhau nhưng dùng chung một không gian:</w:t>
       </w:r>
     </w:p>
     <w:tbl>
@@ -1669,107 +1669,6 @@
           </w:p>
         </w:tc>
       </w:tr>
-      <w:tr>
-        <w:trPr>
-          <w:tblHeader w:val="false"/>
-        </w:trPr>
-        <w:tc>
-          <w:tcPr>
-            <w:tcW w:type="dxa" w:w="2120"/>
-            <w:tcBorders>
-              <w:top w:val="single" w:color="9AA5A0" w:sz="4"/>
-              <w:left w:val="single" w:color="9AA5A0" w:sz="4"/>
-              <w:bottom w:val="single" w:color="9AA5A0" w:sz="4"/>
-              <w:right w:val="single" w:color="9AA5A0" w:sz="4"/>
-            </w:tcBorders>
-            <w:tcMar>
-              <w:top w:type="dxa" w:w="60"/>
-              <w:left w:type="dxa" w:w="100"/>
-              <w:bottom w:type="dxa" w:w="60"/>
-              <w:right w:type="dxa" w:w="100"/>
-            </w:tcMar>
-          </w:tcPr>
-          <w:p>
-            <w:pPr>
-              <w:spacing w:after="40"/>
-            </w:pPr>
-            <w:r>
-              <w:rPr>
-                <w:rFonts w:ascii="Times New Roman" w:cs="Times New Roman" w:eastAsia="Times New Roman" w:hAnsi="Times New Roman"/>
-                <w:b w:val="false"/>
-                <w:bCs w:val="false"/>
-                <w:sz w:val="23"/>
-                <w:szCs w:val="23"/>
-              </w:rPr>
-              <w:t xml:space="preserve">Cộng đồng đổi mới sáng tạo – sinh viên, startup, các trường</w:t>
-            </w:r>
-          </w:p>
-        </w:tc>
-        <w:tc>
-          <w:tcPr>
-            <w:tcW w:type="dxa" w:w="3662"/>
-            <w:tcBorders>
-              <w:top w:val="single" w:color="9AA5A0" w:sz="4"/>
-              <w:left w:val="single" w:color="9AA5A0" w:sz="4"/>
-              <w:bottom w:val="single" w:color="9AA5A0" w:sz="4"/>
-              <w:right w:val="single" w:color="9AA5A0" w:sz="4"/>
-            </w:tcBorders>
-            <w:tcMar>
-              <w:top w:type="dxa" w:w="60"/>
-              <w:left w:type="dxa" w:w="100"/>
-              <w:bottom w:type="dxa" w:w="60"/>
-              <w:right w:type="dxa" w:w="100"/>
-            </w:tcMar>
-          </w:tcPr>
-          <w:p>
-            <w:pPr>
-              <w:spacing w:after="40"/>
-            </w:pPr>
-            <w:r>
-              <w:rPr>
-                <w:rFonts w:ascii="Times New Roman" w:cs="Times New Roman" w:eastAsia="Times New Roman" w:hAnsi="Times New Roman"/>
-                <w:b w:val="false"/>
-                <w:bCs w:val="false"/>
-                <w:sz w:val="23"/>
-                <w:szCs w:val="23"/>
-              </w:rPr>
-              <w:t xml:space="preserve">Nơi giới thiệu dự án, thử nghiệm ý tưởng với cộng đồng thật.</w:t>
-            </w:r>
-          </w:p>
-        </w:tc>
-        <w:tc>
-          <w:tcPr>
-            <w:tcW w:type="dxa" w:w="3856"/>
-            <w:tcBorders>
-              <w:top w:val="single" w:color="9AA5A0" w:sz="4"/>
-              <w:left w:val="single" w:color="9AA5A0" w:sz="4"/>
-              <w:bottom w:val="single" w:color="9AA5A0" w:sz="4"/>
-              <w:right w:val="single" w:color="9AA5A0" w:sz="4"/>
-            </w:tcBorders>
-            <w:tcMar>
-              <w:top w:type="dxa" w:w="60"/>
-              <w:left w:type="dxa" w:w="100"/>
-              <w:bottom w:type="dxa" w:w="60"/>
-              <w:right w:type="dxa" w:w="100"/>
-            </w:tcMar>
-          </w:tcPr>
-          <w:p>
-            <w:pPr>
-              <w:spacing w:after="40"/>
-            </w:pPr>
-            <w:r>
-              <w:rPr>
-                <w:rFonts w:ascii="Times New Roman" w:cs="Times New Roman" w:eastAsia="Times New Roman" w:hAnsi="Times New Roman"/>
-                <w:b w:val="false"/>
-                <w:bCs w:val="false"/>
-                <w:sz w:val="23"/>
-                <w:szCs w:val="23"/>
-              </w:rPr>
-              <w:t xml:space="preserve">Bảng Đổi mới Sơn Trà trưng bày luân phiên; workshop cuối tuần ở Nhà Thuyền; chiếu phim hoạt hình AI của cuộc thi SIF.</w:t>
-            </w:r>
-          </w:p>
-        </w:tc>
-      </w:tr>
     </w:tbl>
     <w:p>
       <w:pPr>
@@ -1810,7 +1709,7 @@
           <w:sz w:val="26"/>
           <w:szCs w:val="26"/>
         </w:rPr>
-        <w:t xml:space="preserve">Điểm chung của cả bốn nhóm là bản sắc làng cá – thúng chai, bến thuyền, con nước, nghề nước mắm. Đây là “tài sản có sẵn” hiếm có, nhưng thế hệ trẻ ngày càng ít cơ hội tiếp xúc. Bến biến tài sản đó thành nội dung học tập và trải nghiệm, đúng tinh thần một “Công viên Đổi mới Sáng tạo”: đổi mới không phải bằng thiết bị đắt tiền, mà bằng cách làm mới cách cộng đồng học, chơi và cùng quyết định về không gian của mình.</w:t>
+        <w:t xml:space="preserve">Điểm chung của cả ba nhóm là bản sắc làng cá – thúng chai, bến thuyền, con nước, nghề nước mắm. Đây là “tài sản có sẵn” hiếm có, nhưng thế hệ trẻ ngày càng ít cơ hội tiếp xúc. Bến biến tài sản đó thành nội dung học tập và trải nghiệm, đúng tinh thần một “Công viên Đổi mới Sáng tạo”: đổi mới không phải bằng thiết bị đắt tiền, mà bằng cách làm mới cách cộng đồng học, chơi và cùng quyết định về không gian của mình.</w:t>
       </w:r>
     </w:p>
     <w:p>
@@ -6050,7 +5949,7 @@
                 <w:sz w:val="23"/>
                 <w:szCs w:val="23"/>
               </w:rPr>
-              <w:t xml:space="preserve">Làm mới “Bảng Đổi mới Sơn Trà”: dự án học sinh, sinh viên, startup</w:t>
+              <w:t xml:space="preserve">Làm mới “Bảng Đổi mới Sơn Trà”: sản phẩm STEM, tranh vẽ của học sinh các trường lân cận, phim hoạt hình AI đoạt giải SIF, ảnh xưa do cư dân góp</w:t>
             </w:r>
           </w:p>
         </w:tc>
@@ -6082,7 +5981,7 @@
                 <w:sz w:val="23"/>
                 <w:szCs w:val="23"/>
               </w:rPr>
-              <w:t xml:space="preserve">Trường học, trung tâm hỗ trợ khởi nghiệp</w:t>
+              <w:t xml:space="preserve">Trường học, UBND phường</w:t>
             </w:r>
           </w:p>
         </w:tc>
@@ -7110,7 +7009,7 @@
                 <w:sz w:val="23"/>
                 <w:szCs w:val="23"/>
               </w:rPr>
-              <w:t xml:space="preserve">Học tập (Hải trình STEM), vui chơi, thể thao, đọc sách (kệ đổi sách), triển lãm – khởi nghiệp, khoa học công nghệ (Bảng Đổi mới Sơn Trà).</w:t>
+              <w:t xml:space="preserve">Học tập (Hải trình STEM), vui chơi, thể thao, đọc sách (kệ đổi sách), triển lãm khoa học – sáng tạo của học sinh (Bảng Đổi mới Sơn Trà).</w:t>
             </w:r>
           </w:p>
         </w:tc>
@@ -7850,7 +7749,7 @@
                 <w:sz w:val="23"/>
                 <w:szCs w:val="23"/>
               </w:rPr>
-              <w:t xml:space="preserve">Công viên được cải tiến liên tục theo ý kiến cộng đồng; nội dung được làm mới từ các cuộc thi, trường học, startup của địa phương.</w:t>
+              <w:t xml:space="preserve">Công viên được cải tiến liên tục theo ý kiến cộng đồng; nội dung được làm mới từ các trường học, cuộc thi sáng tạo và ký ức do chính cư dân đóng góp.</w:t>
             </w:r>
           </w:p>
         </w:tc>

</xml_diff>

<commit_message>
Bến Số thành trò chơi Săn Kho Báu (mở câu đố theo mã QR tại trạm, đổi câu đố theo ngày/mùa, điểm và rương báu); cập nhật thuyết minh và câu lệnh ảnh
Co-Authored-By: Claude Opus 5.5 <noreply@anthropic.com>
Claude-Session: https://claude.ai/code/session_016yb9UGMBdrbj8VwQqTGQjm
</commit_message>
<xml_diff>
--- a/thuyetminh/Thuyet_minh_Ben_Sang_Tao_Vung_Thung.docx
+++ b/thuyetminh/Thuyet_minh_Ben_Sang_Tao_Vung_Thung.docx
@@ -1012,7 +1012,7 @@
           <w:sz w:val="26"/>
           <w:szCs w:val="26"/>
         </w:rPr>
-        <w:t xml:space="preserve">6 trạm dọc lối đi vòng dành cho trẻ em, các lớp học ngoài trời và du khách; mỗi trạm kể một nét của nghề biển bằng ngôn ngữ khoa học – vì sao thúng chai nổi, nút buộc của ngư dân, con nước và mặt trăng, nhìn sao đi biển đến GPS, muối và nước mắm, hành trình chai nhựa ra biển. Trẻ em học khoa học từ chính nghề của ông bà mình.</w:t>
+        <w:t xml:space="preserve">6 trạm dọc lối đi hình con thuyền dành cho trẻ em, các lớp học ngoài trời và du khách; mỗi trạm kể một nét của nghề biển bằng ngôn ngữ khoa học – vì sao thúng chai nổi, nút buộc của ngư dân, con nước và mặt trăng, nhìn sao đi biển đến GPS, muối và nước mắm, hành trình chai nhựa ra biển. Trẻ em học khoa học từ chính nghề của ông bà mình.</w:t>
       </w:r>
     </w:p>
     <w:p>
@@ -1880,7 +1880,7 @@
                 <w:sz w:val="23"/>
                 <w:szCs w:val="23"/>
               </w:rPr>
-              <w:t xml:space="preserve">Mọi không gian được thiết kế trước hết cho người dân dùng mỗi ngày. Các sự kiện cuối tuần (workshop, chiếu phim) tận dụng lại chính bãi cỏ và Nhà Thuyền, không xây công trình riêng chỉ để làm sự kiện.</w:t>
+              <w:t xml:space="preserve">Mọi không gian được thiết kế trước hết cho người dân dùng mỗi ngày. Các sự kiện cuối tuần (workshop, chiếu phim) tận dụng lại chính bãi cỏ và Giàn Thuyền Hoa Giấy, không xây công trình riêng chỉ để làm sự kiện.</w:t>
             </w:r>
           </w:p>
         </w:tc>
@@ -2699,7 +2699,7 @@
                 <w:sz w:val="23"/>
                 <w:szCs w:val="23"/>
               </w:rPr>
-              <w:t xml:space="preserve">Nhà Thuyền (GĐ2)</w:t>
+              <w:t xml:space="preserve">Giàn Thuyền Hoa Giấy</w:t>
             </w:r>
           </w:p>
         </w:tc>
@@ -2731,7 +2731,7 @@
                 <w:sz w:val="23"/>
                 <w:szCs w:val="23"/>
               </w:rPr>
-              <w:t xml:space="preserve">Cạnh Sân Bến, trong vòng lối đi</w:t>
+              <w:t xml:space="preserve">Giữa công viên, trong lòng lối đi hình thuyền</w:t>
             </w:r>
           </w:p>
         </w:tc>
@@ -2763,7 +2763,7 @@
                 <w:sz w:val="23"/>
                 <w:szCs w:val="23"/>
               </w:rPr>
-              <w:t xml:space="preserve">40 m²</w:t>
+              <w:t xml:space="preserve">100 m²</w:t>
             </w:r>
           </w:p>
         </w:tc>
@@ -2795,7 +2795,7 @@
                 <w:sz w:val="23"/>
                 <w:szCs w:val="23"/>
               </w:rPr>
-              <w:t xml:space="preserve">Giàn che lắp ghép, mái cong như thuyền úp: bóng mát, chỗ workshop, kệ đổi sách. Kết cấu nhẹ, tháo lắp được; triển khai khi được phường chấp thuận.</w:t>
+              <w:t xml:space="preserve">Giàn che dài ~20 m, rộng ~7,5 m, mặt bằng hình thân thuyền, khung thép sơn giả gỗ hoặc tre xử lý; hoa giấy trồng ở chân cột, leo phủ kín mái – vừa che nắng vừa nở hoa quanh năm, chịu nắng, gió biển và ít cần tưới. Là chỗ ngồi mát, nơi tập trung lớp học ngoài trời và sinh hoạt cuối tuần.</w:t>
             </w:r>
           </w:p>
         </w:tc>
@@ -3231,7 +3231,7 @@
                 <w:sz w:val="23"/>
                 <w:szCs w:val="23"/>
               </w:rPr>
-              <w:t xml:space="preserve">Lối đi Hải trình</w:t>
+              <w:t xml:space="preserve">Lối đi hình con thuyền</w:t>
             </w:r>
           </w:p>
         </w:tc>
@@ -3263,7 +3263,7 @@
                 <w:sz w:val="23"/>
                 <w:szCs w:val="23"/>
               </w:rPr>
-              <w:t xml:space="preserve">Vòng quanh Sân Bến và nhánh ra Lý Nhật Quang, dài ~135 m</w:t>
+              <w:t xml:space="preserve">Vòng quanh Sân Bến và Giàn Thuyền, mũi thuyền hướng về đường Lý Nhật Quang, dài ~145 m</w:t>
             </w:r>
           </w:p>
         </w:tc>
@@ -3295,7 +3295,7 @@
                 <w:sz w:val="23"/>
                 <w:szCs w:val="23"/>
               </w:rPr>
-              <w:t xml:space="preserve">340 m²</w:t>
+              <w:t xml:space="preserve">370 m²</w:t>
             </w:r>
           </w:p>
         </w:tc>
@@ -3327,7 +3327,7 @@
                 <w:sz w:val="23"/>
                 <w:szCs w:val="23"/>
               </w:rPr>
-              <w:t xml:space="preserve">Lối đi thấm nước, rộng ~2,5 m cho xe lăn, xe đẩy; 6 trạm STEM dọc lối đi; nối với 5 lối vào từ 3 mặt đường.</w:t>
+              <w:t xml:space="preserve">Nhìn từ trên cao, lối đi có dáng một con thuyền – “con thuyền” mà cả khu phố cùng bước lên. Lối đi thấm nước, rộng ~2,5 m cho xe lăn, xe đẩy; 6 trạm dọc lối đi; nối với 5 lối vào từ 3 mặt đường.</w:t>
             </w:r>
           </w:p>
         </w:tc>
@@ -4767,7 +4767,7 @@
                 <w:sz w:val="23"/>
                 <w:szCs w:val="23"/>
               </w:rPr>
-              <w:t xml:space="preserve">Bản đồ số, Hải trình</w:t>
+              <w:t xml:space="preserve">Săn Kho Báu Vũng Thùng</w:t>
             </w:r>
           </w:p>
         </w:tc>
@@ -4799,7 +4799,145 @@
                 <w:sz w:val="23"/>
                 <w:szCs w:val="23"/>
               </w:rPr>
-              <w:t xml:space="preserve">Quét QR tại cổng hoặc tại trạm để xem bản đồ, nội dung 6 trạm, nghe đọc, làm câu đố, thu thập huy hiệu (lưu trên máy người dùng).</w:t>
+              <w:t xml:space="preserve">Trò chơi giải đố gắn với địa điểm: câu đố của mỗi trạm CHỈ mở khi người chơi đứng tại trạm và quét mã QR trên biển trạm (mở trong 2 giờ). Giải đúng nhận một “mảnh hải đồ” khắc chữ cái; đủ 6 chữ ghép thành mật mã để mở “rương báu” ở Cổng Bến. Ba dạng câu đố: chọn đáp án, ổ khóa số (tính toán), mảnh giấy bị xé (sắp xếp thứ tự).</w:t>
+            </w:r>
+          </w:p>
+        </w:tc>
+      </w:tr>
+      <w:tr>
+        <w:trPr>
+          <w:tblHeader w:val="false"/>
+        </w:trPr>
+        <w:tc>
+          <w:tcPr>
+            <w:tcW w:type="dxa" w:w="2699"/>
+            <w:tcBorders>
+              <w:top w:val="single" w:color="9AA5A0" w:sz="4"/>
+              <w:left w:val="single" w:color="9AA5A0" w:sz="4"/>
+              <w:bottom w:val="single" w:color="9AA5A0" w:sz="4"/>
+              <w:right w:val="single" w:color="9AA5A0" w:sz="4"/>
+            </w:tcBorders>
+            <w:tcMar>
+              <w:top w:type="dxa" w:w="60"/>
+              <w:left w:type="dxa" w:w="100"/>
+              <w:bottom w:type="dxa" w:w="60"/>
+              <w:right w:type="dxa" w:w="100"/>
+            </w:tcMar>
+          </w:tcPr>
+          <w:p>
+            <w:pPr>
+              <w:spacing w:after="40"/>
+            </w:pPr>
+            <w:r>
+              <w:rPr>
+                <w:rFonts w:ascii="Times New Roman" w:cs="Times New Roman" w:eastAsia="Times New Roman" w:hAnsi="Times New Roman"/>
+                <w:b w:val="false"/>
+                <w:bCs w:val="false"/>
+                <w:sz w:val="23"/>
+                <w:szCs w:val="23"/>
+              </w:rPr>
+              <w:t xml:space="preserve">Luôn mới: đổi mỗi ngày, mỗi mùa</w:t>
+            </w:r>
+          </w:p>
+        </w:tc>
+        <w:tc>
+          <w:tcPr>
+            <w:tcW w:type="dxa" w:w="6939"/>
+            <w:tcBorders>
+              <w:top w:val="single" w:color="9AA5A0" w:sz="4"/>
+              <w:left w:val="single" w:color="9AA5A0" w:sz="4"/>
+              <w:bottom w:val="single" w:color="9AA5A0" w:sz="4"/>
+              <w:right w:val="single" w:color="9AA5A0" w:sz="4"/>
+            </w:tcBorders>
+            <w:tcMar>
+              <w:top w:type="dxa" w:w="60"/>
+              <w:left w:type="dxa" w:w="100"/>
+              <w:bottom w:type="dxa" w:w="60"/>
+              <w:right w:type="dxa" w:w="100"/>
+            </w:tcMar>
+          </w:tcPr>
+          <w:p>
+            <w:pPr>
+              <w:spacing w:after="40"/>
+            </w:pPr>
+            <w:r>
+              <w:rPr>
+                <w:rFonts w:ascii="Times New Roman" w:cs="Times New Roman" w:eastAsia="Times New Roman" w:hAnsi="Times New Roman"/>
+                <w:b w:val="false"/>
+                <w:bCs w:val="false"/>
+                <w:sz w:val="23"/>
+                <w:szCs w:val="23"/>
+              </w:rPr>
+              <w:t xml:space="preserve">Mỗi trạm có một kho câu đố xoay vòng theo ngày – quay lại hôm sau gặp câu khác. Mỗi tháng là một “mùa” với chủ đề, câu đố và mật mã rương mới (Mùa 1: Bí mật Thúng Chai; Mùa 2: Mật mã Con Nước; Mùa 3: Hải đồ Sao Trời…). Mã QR trên biển trạm giữ nguyên, chỉ nội dung phía sau được làm mới – không tốn chi phí in lại.</w:t>
+            </w:r>
+          </w:p>
+        </w:tc>
+      </w:tr>
+      <w:tr>
+        <w:trPr>
+          <w:tblHeader w:val="false"/>
+        </w:trPr>
+        <w:tc>
+          <w:tcPr>
+            <w:tcW w:type="dxa" w:w="2699"/>
+            <w:tcBorders>
+              <w:top w:val="single" w:color="9AA5A0" w:sz="4"/>
+              <w:left w:val="single" w:color="9AA5A0" w:sz="4"/>
+              <w:bottom w:val="single" w:color="9AA5A0" w:sz="4"/>
+              <w:right w:val="single" w:color="9AA5A0" w:sz="4"/>
+            </w:tcBorders>
+            <w:tcMar>
+              <w:top w:type="dxa" w:w="60"/>
+              <w:left w:type="dxa" w:w="100"/>
+              <w:bottom w:type="dxa" w:w="60"/>
+              <w:right w:type="dxa" w:w="100"/>
+            </w:tcMar>
+          </w:tcPr>
+          <w:p>
+            <w:pPr>
+              <w:spacing w:after="40"/>
+            </w:pPr>
+            <w:r>
+              <w:rPr>
+                <w:rFonts w:ascii="Times New Roman" w:cs="Times New Roman" w:eastAsia="Times New Roman" w:hAnsi="Times New Roman"/>
+                <w:b w:val="false"/>
+                <w:bCs w:val="false"/>
+                <w:sz w:val="23"/>
+                <w:szCs w:val="23"/>
+              </w:rPr>
+              <w:t xml:space="preserve">Điểm, cấp bậc, thẻ thủy thủ</w:t>
+            </w:r>
+          </w:p>
+        </w:tc>
+        <w:tc>
+          <w:tcPr>
+            <w:tcW w:type="dxa" w:w="6939"/>
+            <w:tcBorders>
+              <w:top w:val="single" w:color="9AA5A0" w:sz="4"/>
+              <w:left w:val="single" w:color="9AA5A0" w:sz="4"/>
+              <w:bottom w:val="single" w:color="9AA5A0" w:sz="4"/>
+              <w:right w:val="single" w:color="9AA5A0" w:sz="4"/>
+            </w:tcBorders>
+            <w:tcMar>
+              <w:top w:type="dxa" w:w="60"/>
+              <w:left w:type="dxa" w:w="100"/>
+              <w:bottom w:type="dxa" w:w="60"/>
+              <w:right w:type="dxa" w:w="100"/>
+            </w:tcMar>
+          </w:tcPr>
+          <w:p>
+            <w:pPr>
+              <w:spacing w:after="40"/>
+            </w:pPr>
+            <w:r>
+              <w:rPr>
+                <w:rFonts w:ascii="Times New Roman" w:cs="Times New Roman" w:eastAsia="Times New Roman" w:hAnsi="Times New Roman"/>
+                <w:b w:val="false"/>
+                <w:bCs w:val="false"/>
+                <w:sz w:val="23"/>
+                <w:szCs w:val="23"/>
+              </w:rPr>
+              <w:t xml:space="preserve">Giải đúng +100 điểm, không dùng gợi ý +50, quay lại vào ngày khác +30, mở rương +300; dùng gợi ý −30. Cấp bậc từ “Thủy thủ tập sự” đến “Huyền thoại Vũng Thùng”. Thẻ thủy thủ dùng mã ngẫu nhiên, không gắn tên; trẻ không có điện thoại dùng thẻ giấy. Điểm đổi quà nhỏ (nhãn dán, huy hiệu) do nhà đỡ đầu tài trợ tại buổi sinh hoạt cuối tuần.</w:t>
             </w:r>
           </w:p>
         </w:tc>
@@ -5352,7 +5490,7 @@
           <w:sz w:val="26"/>
           <w:szCs w:val="26"/>
         </w:rPr>
-        <w:t xml:space="preserve">Sản xuất nội dung: </w:t>
+        <w:t xml:space="preserve">Làm mới câu đố mỗi mùa: </w:t>
       </w:r>
       <w:r>
         <w:rPr>
@@ -5360,7 +5498,7 @@
           <w:sz w:val="26"/>
           <w:szCs w:val="26"/>
         </w:rPr>
-        <w:t xml:space="preserve">AI hỗ trợ vẽ tranh minh họa, tạo bản nháp, đọc giọng nói; mọi nội dung đều được con người biên tập, kiểm tra trước khi công bố.</w:t>
+        <w:t xml:space="preserve">giáo viên chọn chủ đề và kiến thức; AI hỗ trợ soạn nháp nhiều biến thể câu đố (chọn đáp án, ổ khóa số, sắp xếp) để mỗi trạm có đủ câu xoay vòng theo ngày; con người kiểm tra tính chính xác trước khi phát hành. Nhờ vậy việc làm mới hằng tháng tốn ít công sức.</w:t>
       </w:r>
     </w:p>
     <w:p>
@@ -5381,7 +5519,7 @@
           <w:sz w:val="26"/>
           <w:szCs w:val="26"/>
         </w:rPr>
-        <w:t xml:space="preserve">Không dùng chatbot trả lời tự do </w:t>
+        <w:t xml:space="preserve">Sản xuất nội dung: </w:t>
       </w:r>
       <w:r>
         <w:rPr>
@@ -5389,24 +5527,7 @@
           <w:sz w:val="26"/>
           <w:szCs w:val="26"/>
         </w:rPr>
-        <w:t xml:space="preserve">cho công chúng, để tránh thông tin sai về lịch sử, văn hóa, tín ngưỡng. AI chỉ đề xuất; con người quyết định.</w:t>
-      </w:r>
-    </w:p>
-    <w:p>
-      <w:pPr>
-        <w:pStyle w:val="Heading2"/>
-        <w:spacing w:after="100" w:before="200"/>
-      </w:pPr>
-      <w:r>
-        <w:rPr>
-          <w:rFonts w:ascii="Times New Roman" w:cs="Times New Roman" w:eastAsia="Times New Roman" w:hAnsi="Times New Roman"/>
-          <w:b/>
-          <w:bCs/>
-          <w:color w:val="023E8A"/>
-          <w:sz w:val="27"/>
-          <w:szCs w:val="27"/>
-        </w:rPr>
-        <w:t xml:space="preserve">5.3. Quyền riêng tư và bảo vệ dữ liệu</w:t>
+        <w:t xml:space="preserve">AI hỗ trợ vẽ tranh minh họa, đọc giọng nói; mọi nội dung đều được con người biên tập, kiểm tra trước khi công bố.</w:t>
       </w:r>
     </w:p>
     <w:p>
@@ -5422,10 +5543,37 @@
       <w:r>
         <w:rPr>
           <w:rFonts w:ascii="Times New Roman" w:cs="Times New Roman" w:eastAsia="Times New Roman" w:hAnsi="Times New Roman"/>
+          <w:b/>
+          <w:bCs/>
           <w:sz w:val="26"/>
           <w:szCs w:val="26"/>
         </w:rPr>
-        <w:t xml:space="preserve">Không đăng nhập, không thu thập dữ liệu của trẻ em; huy hiệu và chứng nhận không ghi tên.</w:t>
+        <w:t xml:space="preserve">Không dùng chatbot trả lời tự do </w:t>
+      </w:r>
+      <w:r>
+        <w:rPr>
+          <w:rFonts w:ascii="Times New Roman" w:cs="Times New Roman" w:eastAsia="Times New Roman" w:hAnsi="Times New Roman"/>
+          <w:sz w:val="26"/>
+          <w:szCs w:val="26"/>
+        </w:rPr>
+        <w:t xml:space="preserve">cho công chúng, để tránh thông tin sai về lịch sử, văn hóa, tín ngưỡng. AI chỉ đề xuất; con người quyết định.</w:t>
+      </w:r>
+    </w:p>
+    <w:p>
+      <w:pPr>
+        <w:pStyle w:val="Heading2"/>
+        <w:spacing w:after="100" w:before="200"/>
+      </w:pPr>
+      <w:r>
+        <w:rPr>
+          <w:rFonts w:ascii="Times New Roman" w:cs="Times New Roman" w:eastAsia="Times New Roman" w:hAnsi="Times New Roman"/>
+          <w:b/>
+          <w:bCs/>
+          <w:color w:val="023E8A"/>
+          <w:sz w:val="27"/>
+          <w:szCs w:val="27"/>
+        </w:rPr>
+        <w:t xml:space="preserve">5.3. Quyền riêng tư và bảo vệ dữ liệu</w:t>
       </w:r>
     </w:p>
     <w:p>
@@ -5444,7 +5592,7 @@
           <w:sz w:val="26"/>
           <w:szCs w:val="26"/>
         </w:rPr>
-        <w:t xml:space="preserve">Form góp ý nhắc người dùng không ghi thông tin cá nhân và tự chặn nội dung có số điện thoại, email.</w:t>
+        <w:t xml:space="preserve">Không đăng nhập, không thu thập dữ liệu của trẻ em; thẻ thủy thủ, điểm và mảnh hải đồ chỉ lưu trên thiết bị, dùng mã ngẫu nhiên không ghi tên.</w:t>
       </w:r>
     </w:p>
     <w:p>
@@ -5463,6 +5611,25 @@
           <w:sz w:val="26"/>
           <w:szCs w:val="26"/>
         </w:rPr>
+        <w:t xml:space="preserve">Form góp ý nhắc người dùng không ghi thông tin cá nhân và tự chặn nội dung có số điện thoại, email.</w:t>
+      </w:r>
+    </w:p>
+    <w:p>
+      <w:pPr>
+        <w:pStyle w:val="ListParagraph"/>
+        <w:numPr>
+          <w:ilvl w:val="0"/>
+          <w:numId w:val="3"/>
+        </w:numPr>
+        <w:spacing w:after="80" w:line="290"/>
+        <w:jc w:val="both"/>
+      </w:pPr>
+      <w:r>
+        <w:rPr>
+          <w:rFonts w:ascii="Times New Roman" w:cs="Times New Roman" w:eastAsia="Times New Roman" w:hAnsi="Times New Roman"/>
+          <w:sz w:val="26"/>
+          <w:szCs w:val="26"/>
+        </w:rPr>
         <w:t xml:space="preserve">Khi vận hành chính thức: tuân thủ quy định pháp luật về bảo vệ dữ liệu cá nhân; nội dung do cư dân đóng góp (như ảnh xưa) chỉ đăng khi có sự đồng ý của người sở hữu và qua kiểm duyệt; có cơ chế yêu cầu gỡ.</w:t>
       </w:r>
     </w:p>
@@ -5494,7 +5661,7 @@
           <w:sz w:val="26"/>
           <w:szCs w:val="26"/>
         </w:rPr>
-        <w:t xml:space="preserve">Nhóm đã xây dựng bản mẫu Bến Số chạy được trên điện thoại (web tĩnh, không cần máy chủ): trang chủ có bản đồ tương tác và lối vào riêng cho trẻ em, giáo viên, du khách, cư dân; 6 trạm với nội dung, nghe đọc, câu đố, huy hiệu và giấy chứng nhận; Hòm ý tưởng với gửi và bình chọn; báo cáo AI mẫu (dữ liệu minh họa); trang lớp học ngoài trời và phiếu học tập in; trang tiếng Anh cho du khách; lịch hoạt động; đỡ đầu; báo sự cố; trang in mã QR cho từng trạm. Địa chỉ: </w:t>
+        <w:t xml:space="preserve">Nhóm đã xây dựng bản mẫu “Săn Kho Báu Vũng Thùng” chạy được trên điện thoại (web tĩnh, không cần máy chủ): hải đồ kho báu tương tác; trang quét mã QR bằng camera (hoặc nhập mã in dưới QR); 6 trạm bị khóa cho tới khi quét đúng mã; 3 dạng câu đố có gợi ý; mảnh hải đồ, rương báu ghép mật mã; điểm, cấp bậc, thẻ thủy thủ; lịch các mùa; trang lớp học ngoài trời, phiếu học tập, trang tiếng Anh; Hòm ý tưởng và báo cáo AI mẫu; trang in mã QR; chế độ trình diễn cho Ban Giám khảo giả lập việc quét mã từ xa. Địa chỉ: </w:t>
       </w:r>
       <w:r>
         <w:rPr>
@@ -6495,7 +6662,7 @@
                 <w:sz w:val="23"/>
                 <w:szCs w:val="23"/>
               </w:rPr>
-              <w:t xml:space="preserve">San nền, thảm cỏ, cây xanh, lối đi thấm nước, sân chơi Thúng Chai, 6 trạm STEM, Cổng Bến, thùng rác phân loại, ra mắt Bến Số</w:t>
+              <w:t xml:space="preserve">San nền, thảm cỏ, cây xanh, lối đi thấm nước, khung Giàn Thuyền và trồng hoa giấy, sân chơi Thúng Chai, 6 trạm STEM, Cổng Bến, thùng rác phân loại, ra mắt Bến Số</w:t>
             </w:r>
           </w:p>
         </w:tc>
@@ -6596,7 +6763,7 @@
                 <w:sz w:val="23"/>
                 <w:szCs w:val="23"/>
               </w:rPr>
-              <w:t xml:space="preserve">Nhà Thuyền (giàn che lắp ghép), dụng cụ thể dục, đèn năng lượng mặt trời chiếu xuống lối đi, kệ đổi sách</w:t>
+              <w:t xml:space="preserve">Hoàn thiện Giàn Thuyền Hoa Giấy (hoa giấy phủ kín mái sau 1–2 năm), dụng cụ thể dục, đèn năng lượng mặt trời chiếu xuống lối đi, kệ đổi sách</w:t>
             </w:r>
           </w:p>
         </w:tc>
@@ -7510,7 +7677,7 @@
                 <w:sz w:val="23"/>
                 <w:szCs w:val="23"/>
               </w:rPr>
-              <w:t xml:space="preserve">Gắn mã QR thông tin cho cây xanh, hiện vật, bảo tàng (cung cấp thông tin một chiều)</w:t>
+              <w:t xml:space="preserve">Gắn mã QR thông tin cho cây xanh, hiện vật, bảo tàng (cung cấp thông tin một chiều, đọc một lần là hết)</w:t>
             </w:r>
           </w:p>
         </w:tc>
@@ -7542,7 +7709,7 @@
                 <w:sz w:val="23"/>
                 <w:szCs w:val="23"/>
               </w:rPr>
-              <w:t xml:space="preserve">QR là cửa vào một hành trình học tập có câu đố, huy hiệu, chứng nhận; nội dung là di sản nghề biển của chính khu dân cư, kể bằng ngôn ngữ khoa học.</w:t>
+              <w:t xml:space="preserve">QR là chìa khóa của một trò chơi săn kho báu gắn với địa điểm: phải đến tận trạm mới mở được câu đố; câu đố đổi mỗi ngày, mật mã rương đổi mỗi tháng; nội dung là khoa học ẩn trong nghề biển của chính khu dân cư.</w:t>
             </w:r>
           </w:p>
         </w:tc>
@@ -8098,7 +8265,7 @@
                 <w:sz w:val="23"/>
                 <w:szCs w:val="23"/>
               </w:rPr>
-              <w:t xml:space="preserve">Muỗi, nước đọng</w:t>
+              <w:t xml:space="preserve">Hoa giấy có gai, rụng lá hoa</w:t>
             </w:r>
           </w:p>
         </w:tc>
@@ -8130,7 +8297,7 @@
                 <w:sz w:val="23"/>
                 <w:szCs w:val="23"/>
               </w:rPr>
-              <w:t xml:space="preserve">Không có mặt nước trang trí; vườn mưa thiết kế thấm hết trong ≤ 48 giờ.</w:t>
+              <w:t xml:space="preserve">Chọn giống hoa giấy ít gai; cắt tỉa để cành chỉ phủ trên mái (cao &gt; 2,5 m), không chìa xuống tầm tay trẻ em; lá hoa rụng nhẹ, dễ quét dọn, không độc.</w:t>
             </w:r>
           </w:p>
         </w:tc>
@@ -8167,7 +8334,7 @@
                 <w:sz w:val="23"/>
                 <w:szCs w:val="23"/>
               </w:rPr>
-              <w:t xml:space="preserve">Cây gãy đổ mùa mưa bão</w:t>
+              <w:t xml:space="preserve">Muỗi, nước đọng</w:t>
             </w:r>
           </w:p>
         </w:tc>
@@ -8199,7 +8366,7 @@
                 <w:sz w:val="23"/>
                 <w:szCs w:val="23"/>
               </w:rPr>
-              <w:t xml:space="preserve">Chọn cây bản địa chịu gió, không giòn gãy; cây lớn chỉ trồng phía mặt đường, cách xa ranh giới lô đất lân cận; cắt tỉa định kỳ.</w:t>
+              <w:t xml:space="preserve">Không có mặt nước trang trí; vườn mưa thiết kế thấm hết trong ≤ 48 giờ.</w:t>
             </w:r>
           </w:p>
         </w:tc>
@@ -8236,7 +8403,7 @@
                 <w:sz w:val="23"/>
                 <w:szCs w:val="23"/>
               </w:rPr>
-              <w:t xml:space="preserve">Góc khuất, mất an ninh ban đêm</w:t>
+              <w:t xml:space="preserve">Cây gãy đổ mùa mưa bão</w:t>
             </w:r>
           </w:p>
         </w:tc>
@@ -8268,7 +8435,7 @@
                 <w:sz w:val="23"/>
                 <w:szCs w:val="23"/>
               </w:rPr>
-              <w:t xml:space="preserve">Cây bụi thấp, cây cao tán cao, tầm nhìn thông thoáng; chiếu sáng lối đi.</w:t>
+              <w:t xml:space="preserve">Chọn cây bản địa chịu gió, không giòn gãy; cây lớn chỉ trồng phía mặt đường, cách xa ranh giới lô đất lân cận; cắt tỉa định kỳ.</w:t>
             </w:r>
           </w:p>
         </w:tc>
@@ -8305,7 +8472,7 @@
                 <w:sz w:val="23"/>
                 <w:szCs w:val="23"/>
               </w:rPr>
-              <w:t xml:space="preserve">Nội dung sai lệch, thiếu chính xác</w:t>
+              <w:t xml:space="preserve">Góc khuất, mất an ninh ban đêm</w:t>
             </w:r>
           </w:p>
         </w:tc>
@@ -8337,7 +8504,7 @@
                 <w:sz w:val="23"/>
                 <w:szCs w:val="23"/>
               </w:rPr>
-              <w:t xml:space="preserve">Không dùng chatbot tự do; nội dung khoa học do giáo viên thẩm định, nội dung văn hóa – tín ngưỡng chỉ giới thiệu, được phường duyệt.</w:t>
+              <w:t xml:space="preserve">Cây bụi thấp, cây cao tán cao, tầm nhìn thông thoáng; chiếu sáng lối đi.</w:t>
             </w:r>
           </w:p>
         </w:tc>
@@ -8374,7 +8541,7 @@
                 <w:sz w:val="23"/>
                 <w:szCs w:val="23"/>
               </w:rPr>
-              <w:t xml:space="preserve">Lộ dữ liệu cá nhân</w:t>
+              <w:t xml:space="preserve">Nội dung sai lệch, thiếu chính xác</w:t>
             </w:r>
           </w:p>
         </w:tc>
@@ -8406,7 +8573,7 @@
                 <w:sz w:val="23"/>
                 <w:szCs w:val="23"/>
               </w:rPr>
-              <w:t xml:space="preserve">Không đăng nhập, không thu dữ liệu trẻ em, chặn số điện thoại/email trong góp ý, ẩn thông tin trước khi đưa cho AI.</w:t>
+              <w:t xml:space="preserve">Không dùng chatbot tự do; nội dung khoa học do giáo viên thẩm định, nội dung văn hóa – tín ngưỡng chỉ giới thiệu, được phường duyệt.</w:t>
             </w:r>
           </w:p>
         </w:tc>
@@ -8443,7 +8610,7 @@
                 <w:sz w:val="23"/>
                 <w:szCs w:val="23"/>
               </w:rPr>
-              <w:t xml:space="preserve">Quảng cáo trá hình trong không gian công cộng</w:t>
+              <w:t xml:space="preserve">Lộ dữ liệu cá nhân</w:t>
             </w:r>
           </w:p>
         </w:tc>
@@ -8475,7 +8642,7 @@
                 <w:sz w:val="23"/>
                 <w:szCs w:val="23"/>
               </w:rPr>
-              <w:t xml:space="preserve">Chỉ ghi nhận tài trợ bằng một dòng chữ nhỏ; không biển quảng cáo, không voucher thương mại.</w:t>
+              <w:t xml:space="preserve">Không đăng nhập, không thu dữ liệu trẻ em, chặn số điện thoại/email trong góp ý, ẩn thông tin trước khi đưa cho AI.</w:t>
             </w:r>
           </w:p>
         </w:tc>
@@ -8512,7 +8679,7 @@
                 <w:sz w:val="23"/>
                 <w:szCs w:val="23"/>
               </w:rPr>
-              <w:t xml:space="preserve">Ít người dùng Bến Số</w:t>
+              <w:t xml:space="preserve">Quảng cáo trá hình trong không gian công cộng</w:t>
             </w:r>
           </w:p>
         </w:tc>
@@ -8544,7 +8711,145 @@
                 <w:sz w:val="23"/>
                 <w:szCs w:val="23"/>
               </w:rPr>
-              <w:t xml:space="preserve">Tóm tắt in sẵn trên biển trạm; gắn với hoạt động trường học và Hải trình Chủ nhật.</w:t>
+              <w:t xml:space="preserve">Chỉ ghi nhận tài trợ bằng một dòng chữ nhỏ; không biển quảng cáo, không voucher thương mại.</w:t>
+            </w:r>
+          </w:p>
+        </w:tc>
+      </w:tr>
+      <w:tr>
+        <w:trPr>
+          <w:tblHeader w:val="false"/>
+        </w:trPr>
+        <w:tc>
+          <w:tcPr>
+            <w:tcW w:type="dxa" w:w="2891"/>
+            <w:tcBorders>
+              <w:top w:val="single" w:color="9AA5A0" w:sz="4"/>
+              <w:left w:val="single" w:color="9AA5A0" w:sz="4"/>
+              <w:bottom w:val="single" w:color="9AA5A0" w:sz="4"/>
+              <w:right w:val="single" w:color="9AA5A0" w:sz="4"/>
+            </w:tcBorders>
+            <w:tcMar>
+              <w:top w:type="dxa" w:w="60"/>
+              <w:left w:type="dxa" w:w="100"/>
+              <w:bottom w:type="dxa" w:w="60"/>
+              <w:right w:type="dxa" w:w="100"/>
+            </w:tcMar>
+          </w:tcPr>
+          <w:p>
+            <w:pPr>
+              <w:spacing w:after="40"/>
+            </w:pPr>
+            <w:r>
+              <w:rPr>
+                <w:rFonts w:ascii="Times New Roman" w:cs="Times New Roman" w:eastAsia="Times New Roman" w:hAnsi="Times New Roman"/>
+                <w:b w:val="false"/>
+                <w:bCs w:val="false"/>
+                <w:sz w:val="23"/>
+                <w:szCs w:val="23"/>
+              </w:rPr>
+              <w:t xml:space="preserve">Trò chơi nhàm chán, người chơi bỏ cuộc sau vài lần</w:t>
+            </w:r>
+          </w:p>
+        </w:tc>
+        <w:tc>
+          <w:tcPr>
+            <w:tcW w:type="dxa" w:w="6747"/>
+            <w:tcBorders>
+              <w:top w:val="single" w:color="9AA5A0" w:sz="4"/>
+              <w:left w:val="single" w:color="9AA5A0" w:sz="4"/>
+              <w:bottom w:val="single" w:color="9AA5A0" w:sz="4"/>
+              <w:right w:val="single" w:color="9AA5A0" w:sz="4"/>
+            </w:tcBorders>
+            <w:tcMar>
+              <w:top w:type="dxa" w:w="60"/>
+              <w:left w:type="dxa" w:w="100"/>
+              <w:bottom w:type="dxa" w:w="60"/>
+              <w:right w:type="dxa" w:w="100"/>
+            </w:tcMar>
+          </w:tcPr>
+          <w:p>
+            <w:pPr>
+              <w:spacing w:after="40"/>
+            </w:pPr>
+            <w:r>
+              <w:rPr>
+                <w:rFonts w:ascii="Times New Roman" w:cs="Times New Roman" w:eastAsia="Times New Roman" w:hAnsi="Times New Roman"/>
+                <w:b w:val="false"/>
+                <w:bCs w:val="false"/>
+                <w:sz w:val="23"/>
+                <w:szCs w:val="23"/>
+              </w:rPr>
+              <w:t xml:space="preserve">Câu đố xoay vòng mỗi ngày, mùa mới mỗi tháng, điểm thưởng khi quay lại, cấp bậc và quà nhỏ; tóm tắt in sẵn trên biển trạm cho người không chơi game.</w:t>
+            </w:r>
+          </w:p>
+        </w:tc>
+      </w:tr>
+      <w:tr>
+        <w:trPr>
+          <w:tblHeader w:val="false"/>
+        </w:trPr>
+        <w:tc>
+          <w:tcPr>
+            <w:tcW w:type="dxa" w:w="2891"/>
+            <w:tcBorders>
+              <w:top w:val="single" w:color="9AA5A0" w:sz="4"/>
+              <w:left w:val="single" w:color="9AA5A0" w:sz="4"/>
+              <w:bottom w:val="single" w:color="9AA5A0" w:sz="4"/>
+              <w:right w:val="single" w:color="9AA5A0" w:sz="4"/>
+            </w:tcBorders>
+            <w:tcMar>
+              <w:top w:type="dxa" w:w="60"/>
+              <w:left w:type="dxa" w:w="100"/>
+              <w:bottom w:type="dxa" w:w="60"/>
+              <w:right w:type="dxa" w:w="100"/>
+            </w:tcMar>
+          </w:tcPr>
+          <w:p>
+            <w:pPr>
+              <w:spacing w:after="40"/>
+            </w:pPr>
+            <w:r>
+              <w:rPr>
+                <w:rFonts w:ascii="Times New Roman" w:cs="Times New Roman" w:eastAsia="Times New Roman" w:hAnsi="Times New Roman"/>
+                <w:b w:val="false"/>
+                <w:bCs w:val="false"/>
+                <w:sz w:val="23"/>
+                <w:szCs w:val="23"/>
+              </w:rPr>
+              <w:t xml:space="preserve">Giải đố “từ xa” mà không đến công viên</w:t>
+            </w:r>
+          </w:p>
+        </w:tc>
+        <w:tc>
+          <w:tcPr>
+            <w:tcW w:type="dxa" w:w="6747"/>
+            <w:tcBorders>
+              <w:top w:val="single" w:color="9AA5A0" w:sz="4"/>
+              <w:left w:val="single" w:color="9AA5A0" w:sz="4"/>
+              <w:bottom w:val="single" w:color="9AA5A0" w:sz="4"/>
+              <w:right w:val="single" w:color="9AA5A0" w:sz="4"/>
+            </w:tcBorders>
+            <w:tcMar>
+              <w:top w:type="dxa" w:w="60"/>
+              <w:left w:type="dxa" w:w="100"/>
+              <w:bottom w:type="dxa" w:w="60"/>
+              <w:right w:type="dxa" w:w="100"/>
+            </w:tcMar>
+          </w:tcPr>
+          <w:p>
+            <w:pPr>
+              <w:spacing w:after="40"/>
+            </w:pPr>
+            <w:r>
+              <w:rPr>
+                <w:rFonts w:ascii="Times New Roman" w:cs="Times New Roman" w:eastAsia="Times New Roman" w:hAnsi="Times New Roman"/>
+                <w:b w:val="false"/>
+                <w:bCs w:val="false"/>
+                <w:sz w:val="23"/>
+                <w:szCs w:val="23"/>
+              </w:rPr>
+              <w:t xml:space="preserve">Câu đố chỉ mở sau khi quét mã tại trạm; khi vận hành thật, mã QR được đổi theo mùa.</w:t>
             </w:r>
           </w:p>
         </w:tc>

</xml_diff>

<commit_message>
Sửa câu đố sắp xếp (đánh số tại chỗ, chạm lại để bỏ), dự phòng khi trình duyệt chặn lưu trữ, rà soát nội dung thuyết minh và sơ đồ
Co-Authored-By: Claude Opus 5.5 <noreply@anthropic.com>
Claude-Session: https://claude.ai/code/session_016yb9UGMBdrbj8VwQqTGQjm
</commit_message>
<xml_diff>
--- a/thuyetminh/Thuyet_minh_Ben_Sang_Tao_Vung_Thung.docx
+++ b/thuyetminh/Thuyet_minh_Ben_Sang_Tao_Vung_Thung.docx
@@ -1041,7 +1041,7 @@
           <w:sz w:val="26"/>
           <w:szCs w:val="26"/>
         </w:rPr>
-        <w:t xml:space="preserve">quét mã QR là dùng được, không cần cài ứng dụng, không đăng nhập. Người dân đề xuất và bình chọn ý tưởng cho công viên; mỗi tháng AI lọc, gom nhóm và tóm tắt góp ý thành báo cáo một trang để tổ dân phố và phường ra quyết định.</w:t>
+        <w:t xml:space="preserve">quét mã QR là dùng được, không cần cài ứng dụng, không đăng nhập. Trò chơi “Săn Kho Báu Vũng Thùng” chỉ mở câu đố khi người chơi đứng tại trạm, câu đố đổi mỗi ngày, mật mã rương đổi mỗi tháng. Người dân đề xuất và bình chọn ý tưởng cho công viên; mỗi tháng AI lọc, gom nhóm và tóm tắt góp ý thành báo cáo một trang để tổ dân phố và phường ra quyết định.</w:t>
       </w:r>
     </w:p>
     <w:p>
@@ -1462,7 +1462,7 @@
                 <w:sz w:val="23"/>
                 <w:szCs w:val="23"/>
               </w:rPr>
-              <w:t xml:space="preserve">Sân chơi Thúng Chai nhìn thấy từ vỉa hè; lối đi vòng ~135 m; Góc thong thả; bãi cỏ Sân Bến cho sinh hoạt cộng đồng; Hòm ý tưởng để chính cư dân quyết định công viên thay đổi thế nào.</w:t>
+              <w:t xml:space="preserve">Sân chơi Thúng Chai nhìn thấy từ vỉa hè; lối đi hình con thuyền ~145 m; Góc thong thả; bãi cỏ Sân Bến cho sinh hoạt cộng đồng; Hòm ý tưởng để chính cư dân quyết định công viên thay đổi thế nào.</w:t>
             </w:r>
           </w:p>
         </w:tc>
@@ -1563,7 +1563,7 @@
                 <w:sz w:val="23"/>
                 <w:szCs w:val="23"/>
               </w:rPr>
-              <w:t xml:space="preserve">Hải trình STEM 6 trạm; gợi ý tiết học 60–75 phút; phiếu học tập in sẵn; học sinh không cần điện thoại riêng hay tài khoản; nhóm đủ 6 huy hiệu nhận chứng nhận.</w:t>
+              <w:t xml:space="preserve">Hải trình STEM 6 trạm; gợi ý tiết học 60–75 phút; phiếu học tập in sẵn; học sinh không cần điện thoại riêng hay tài khoản; cả lớp cùng giải đố, ghép mật mã và mở rương báu.</w:t>
             </w:r>
           </w:p>
         </w:tc>
@@ -3633,7 +3633,7 @@
           <w:sz w:val="26"/>
           <w:szCs w:val="26"/>
         </w:rPr>
-        <w:t xml:space="preserve">Mỗi trạm gồm: biển thấp vừa tầm mắt trẻ em bằng vật liệu bền (gỗ xử lý/composite), một chi tiết tương tác cơ học đơn giản (không dùng điện, không dùng nước), phần tóm tắt in trực tiếp trên biển cho người không dùng điện thoại, và mã QR mở nội dung đầy đủ trên Bến Số (bài đọc, nghe đọc, thí nghiệm tại nhà, câu đố nhận huy hiệu).</w:t>
+        <w:t xml:space="preserve">Mỗi trạm gồm: biển thấp vừa tầm mắt trẻ em bằng vật liệu bền (gỗ xử lý/composite), một chi tiết tương tác cơ học đơn giản (không dùng điện, không dùng nước), phần tóm tắt in trực tiếp trên biển cho người không dùng điện thoại, và mã QR – chiếc “chìa khóa” mở câu đố Săn Kho Báu của trạm (chỉ mở khi quét tại chỗ) cùng bài đọc, nghe đọc và thí nghiệm tại nhà.</w:t>
       </w:r>
     </w:p>
     <w:tbl>
@@ -4611,7 +4611,7 @@
           <w:sz w:val="26"/>
           <w:szCs w:val="26"/>
         </w:rPr>
-        <w:t xml:space="preserve">biến công viên thành lớp học ngoài trời cho các trường lân cận; giữ gìn ký ức nghề biển theo cách hấp dẫn thế hệ trẻ; hoàn thành 6 trạm nhận giấy chứng nhận “Nhà Thám Hiểm Bến Sáng Tạo” (không ghi tên, không lưu thông tin cá nhân). Nội dung khoa học viết ở mức phổ thông và sẽ được giáo viên thẩm định trước khi triển khai.</w:t>
+        <w:t xml:space="preserve">biến công viên thành lớp học ngoài trời cho các trường lân cận; giữ gìn ký ức nghề biển theo cách hấp dẫn thế hệ trẻ; giải đủ 6 trạm để ghép mật mã, mở rương báu và lên cấp thủy thủ (không ghi tên, không lưu thông tin cá nhân); câu đố đổi mỗi ngày và mỗi mùa nên các em muốn quay lại. Nội dung khoa học viết ở mức phổ thông và sẽ được giáo viên thẩm định trước khi triển khai.</w:t>
       </w:r>
     </w:p>
     <w:p>

</xml_diff>